<commit_message>
Small annendum to development methodology
</commit_message>
<xml_diff>
--- a/Assignment 1_ Initial Thoughts and System Design (A1).docx
+++ b/Assignment 1_ Initial Thoughts and System Design (A1).docx
@@ -130,7 +130,13 @@
     </w:p>
     <w:p>
       <w:r>
-        <w:t xml:space="preserve">For this project we will be using the SCRUM development methodology. Scrum is an agile framework that divides the work into multiple sections called sprints. This allows us to build the project through iterative updates while giving us the flexibility of adjusting our design at any point during the process if changes are required. This is ideal for our project which is split into multiple assignments that require us to build our application piece by piece. Every work cycle will require us to evenly split the work amongst our group, execute our plan, receive feedback, and continuously improve our application. With everyone involved in every cycle, everyone becomes familiar with every section of the application which facilitates communication within our group. </w:t>
+        <w:t>For this project we will be using the SCRUM development methodology. Scrum is an agile framework that divides the work into multiple sections called sprints. This allows us to build the project through iterative updates while giving us the flexibility of adjusting our design at any point during the process if changes are required. This is ideal for our project which is split into multiple assignments that require us to build our application piece by piece. Every work cycle will require us to evenly split the work amongst our group, execute our plan, receive feedback, and continuously improve our application.</w:t>
+      </w:r>
+      <w:r>
+        <w:t xml:space="preserve"> By using a shared repository on GitHub we can coordinate our work efficiently and have a record of our individual contributions for each cycle of the project. </w:t>
+      </w:r>
+      <w:r>
+        <w:t xml:space="preserve"> With everyone involved in every cycle, everyone becomes familiar with every section of the application which facilitates communication within our group. </w:t>
       </w:r>
       <w:r>
         <w:pict w14:anchorId="5AF3AA6A">

</xml_diff>

<commit_message>
Quick Reformat + Adding Names to Contributions
</commit_message>
<xml_diff>
--- a/Assignment 1_ Initial Thoughts and System Design (A1).docx
+++ b/Assignment 1_ Initial Thoughts and System Design (A1).docx
@@ -42,7 +42,6 @@
       </w:pPr>
       <w:bookmarkStart w:id="1" w:name="_o2lkjt5mhw88" w:colFirst="0" w:colLast="0"/>
       <w:bookmarkEnd w:id="1"/>
-      <w:proofErr w:type="spellStart"/>
       <w:r>
         <w:rPr>
           <w:b/>
@@ -50,17 +49,7 @@
           <w:sz w:val="34"/>
           <w:szCs w:val="34"/>
         </w:rPr>
-        <w:t>QueueSmart</w:t>
-      </w:r>
-      <w:proofErr w:type="spellEnd"/>
-      <w:r>
-        <w:rPr>
-          <w:b/>
-          <w:bCs/>
-          <w:sz w:val="34"/>
-          <w:szCs w:val="34"/>
-        </w:rPr>
-        <w:t xml:space="preserve"> – Smart Queue Management Application</w:t>
+        <w:t>QueueSmart – Smart Queue Management Application</w:t>
       </w:r>
     </w:p>
     <w:p>
@@ -129,11 +118,22 @@
       </w:r>
     </w:p>
     <w:p>
+      <w:pPr>
+        <w:ind w:firstLine="720"/>
+      </w:pPr>
       <w:r>
         <w:t>For this project we will be using the SCRUM development methodology. Scrum is an agile framework that divides the work into multiple sections called sprints. This allows us to build the project through iterative updates while giving us the flexibility of adjusting our design at any point during the process if changes are required. This is ideal for our project which is split into multiple assignments that require us to build our application piece by piece. Every work cycle will require us to evenly split the work amongst our group, execute our plan, receive feedback, and continuously improve our application.</w:t>
       </w:r>
       <w:r>
-        <w:t xml:space="preserve"> By using a shared repository on GitHub we can coordinate our work efficiently and have a record of our individual contributions for each cycle of the project. </w:t>
+        <w:t xml:space="preserve"> </w:t>
+      </w:r>
+    </w:p>
+    <w:p>
+      <w:pPr>
+        <w:ind w:firstLine="720"/>
+      </w:pPr>
+      <w:r>
+        <w:t>By using a shared repository on GitHub we can coordinate our work efficiently and have a record of our individual contributions for each cycle of the project.</w:t>
       </w:r>
       <w:r>
         <w:t xml:space="preserve"> With everyone involved in every cycle, everyone becomes familiar with every section of the application which facilitates communication within our group. </w:t>
@@ -289,6 +289,7 @@
           <w:sz w:val="26"/>
           <w:szCs w:val="26"/>
         </w:rPr>
+        <w:lastRenderedPageBreak/>
         <w:t>Container Diagram Explanation</w:t>
       </w:r>
     </w:p>
@@ -297,7 +298,6 @@
         <w:spacing w:before="240" w:after="240"/>
       </w:pPr>
       <w:r>
-        <w:lastRenderedPageBreak/>
         <w:t>//text here</w:t>
       </w:r>
     </w:p>
@@ -390,8 +390,8 @@
         <w:tblLook w:val="0600" w:firstRow="0" w:lastRow="0" w:firstColumn="0" w:lastColumn="0" w:noHBand="1" w:noVBand="1"/>
       </w:tblPr>
       <w:tblGrid>
-        <w:gridCol w:w="1246"/>
-        <w:gridCol w:w="5059"/>
+        <w:gridCol w:w="1260"/>
+        <w:gridCol w:w="5045"/>
         <w:gridCol w:w="3055"/>
       </w:tblGrid>
       <w:tr>
@@ -400,7 +400,7 @@
         </w:trPr>
         <w:tc>
           <w:tcPr>
-            <w:tcW w:w="1246" w:type="dxa"/>
+            <w:tcW w:w="1260" w:type="dxa"/>
             <w:tcBorders>
               <w:top w:val="nil"/>
               <w:left w:val="nil"/>
@@ -429,7 +429,7 @@
         </w:tc>
         <w:tc>
           <w:tcPr>
-            <w:tcW w:w="5058" w:type="dxa"/>
+            <w:tcW w:w="5045" w:type="dxa"/>
             <w:tcBorders>
               <w:top w:val="nil"/>
               <w:left w:val="nil"/>
@@ -492,7 +492,7 @@
         </w:trPr>
         <w:tc>
           <w:tcPr>
-            <w:tcW w:w="1246" w:type="dxa"/>
+            <w:tcW w:w="1260" w:type="dxa"/>
             <w:tcBorders>
               <w:top w:val="nil"/>
               <w:left w:val="nil"/>
@@ -514,7 +514,7 @@
         </w:tc>
         <w:tc>
           <w:tcPr>
-            <w:tcW w:w="5058" w:type="dxa"/>
+            <w:tcW w:w="5045" w:type="dxa"/>
             <w:tcBorders>
               <w:top w:val="nil"/>
               <w:left w:val="nil"/>
@@ -563,7 +563,7 @@
         </w:trPr>
         <w:tc>
           <w:tcPr>
-            <w:tcW w:w="1246" w:type="dxa"/>
+            <w:tcW w:w="1260" w:type="dxa"/>
             <w:tcBorders>
               <w:top w:val="nil"/>
               <w:left w:val="nil"/>
@@ -579,13 +579,13 @@
           </w:tcPr>
           <w:p>
             <w:r>
-              <w:t>Member 2</w:t>
+              <w:t>Alan Garcia</w:t>
             </w:r>
           </w:p>
         </w:tc>
         <w:tc>
           <w:tcPr>
-            <w:tcW w:w="5058" w:type="dxa"/>
+            <w:tcW w:w="5045" w:type="dxa"/>
             <w:tcBorders>
               <w:top w:val="nil"/>
               <w:left w:val="nil"/>
@@ -634,7 +634,7 @@
         </w:trPr>
         <w:tc>
           <w:tcPr>
-            <w:tcW w:w="1246" w:type="dxa"/>
+            <w:tcW w:w="1260" w:type="dxa"/>
             <w:tcBorders>
               <w:top w:val="nil"/>
               <w:left w:val="nil"/>
@@ -656,7 +656,7 @@
         </w:tc>
         <w:tc>
           <w:tcPr>
-            <w:tcW w:w="5058" w:type="dxa"/>
+            <w:tcW w:w="5045" w:type="dxa"/>
             <w:tcBorders>
               <w:top w:val="nil"/>
               <w:left w:val="nil"/>
@@ -705,7 +705,7 @@
         </w:trPr>
         <w:tc>
           <w:tcPr>
-            <w:tcW w:w="1246" w:type="dxa"/>
+            <w:tcW w:w="1260" w:type="dxa"/>
             <w:tcBorders>
               <w:top w:val="nil"/>
               <w:left w:val="nil"/>
@@ -721,13 +721,13 @@
           </w:tcPr>
           <w:p>
             <w:r>
-              <w:t>Member 4</w:t>
+              <w:t>Tyler Landgrebe</w:t>
             </w:r>
           </w:p>
         </w:tc>
         <w:tc>
           <w:tcPr>
-            <w:tcW w:w="5058" w:type="dxa"/>
+            <w:tcW w:w="5045" w:type="dxa"/>
             <w:tcBorders>
               <w:top w:val="nil"/>
               <w:left w:val="nil"/>

</xml_diff>

<commit_message>
3.2 (optional container diagram) complete, will do 4 soon
</commit_message>
<xml_diff>
--- a/Assignment 1_ Initial Thoughts and System Design (A1).docx
+++ b/Assignment 1_ Initial Thoughts and System Design (A1).docx
@@ -42,6 +42,7 @@
       </w:pPr>
       <w:bookmarkStart w:id="1" w:name="_o2lkjt5mhw88" w:colFirst="0" w:colLast="0"/>
       <w:bookmarkEnd w:id="1"/>
+      <w:proofErr w:type="spellStart"/>
       <w:r>
         <w:rPr>
           <w:b/>
@@ -49,7 +50,17 @@
           <w:sz w:val="34"/>
           <w:szCs w:val="34"/>
         </w:rPr>
-        <w:t>QueueSmart – Smart Queue Management Application</w:t>
+        <w:t>QueueSmart</w:t>
+      </w:r>
+      <w:proofErr w:type="spellEnd"/>
+      <w:r>
+        <w:rPr>
+          <w:b/>
+          <w:bCs/>
+          <w:sz w:val="34"/>
+          <w:szCs w:val="34"/>
+        </w:rPr>
+        <w:t xml:space="preserve"> – Smart Queue Management Application</w:t>
       </w:r>
     </w:p>
     <w:p>
@@ -133,7 +144,23 @@
         <w:ind w:firstLine="720"/>
       </w:pPr>
       <w:r>
-        <w:t>By using a shared repository on GitHub we can coordinate our work efficiently and have a record of our individual contributions for each cycle of the project.</w:t>
+        <w:t xml:space="preserve">By using a shared repository on </w:t>
+      </w:r>
+      <w:proofErr w:type="gramStart"/>
+      <w:r>
+        <w:t>GitHub</w:t>
+      </w:r>
+      <w:proofErr w:type="gramEnd"/>
+      <w:r>
+        <w:t xml:space="preserve"> we can coordinate our work efficiently and have a record of our individual contributions for each </w:t>
+      </w:r>
+      <w:proofErr w:type="gramStart"/>
+      <w:r>
+        <w:t>cycle of the project</w:t>
+      </w:r>
+      <w:proofErr w:type="gramEnd"/>
+      <w:r>
+        <w:t>.</w:t>
       </w:r>
       <w:r>
         <w:t xml:space="preserve"> With everyone involved in every cycle, everyone becomes familiar with every section of the application which facilitates communication within our group. </w:t>
@@ -196,6 +223,7 @@
         <w:t>3.1 System Context Diagram</w:t>
       </w:r>
     </w:p>
+    <w:p/>
     <w:p>
       <w:pPr>
         <w:pStyle w:val="Heading3"/>
@@ -224,9 +252,6 @@
       </w:r>
     </w:p>
     <w:p>
-      <w:pPr>
-        <w:spacing w:before="240" w:after="240"/>
-      </w:pPr>
       <w:r>
         <w:t>//text here</w:t>
       </w:r>
@@ -266,6 +291,62 @@
       </w:r>
     </w:p>
     <w:p>
+      <w:r>
+        <w:rPr>
+          <w:lang w:val="en-US"/>
+        </w:rPr>
+        <w:lastRenderedPageBreak/>
+        <w:drawing>
+          <wp:inline distT="0" distB="0" distL="0" distR="0" wp14:anchorId="49E371E0" wp14:editId="2431EB25">
+            <wp:extent cx="5943600" cy="944880"/>
+            <wp:effectExtent l="0" t="0" r="0" b="7620"/>
+            <wp:docPr id="1623405986" name="Picture 2"/>
+            <wp:cNvGraphicFramePr>
+              <a:graphicFrameLocks xmlns:a="http://schemas.openxmlformats.org/drawingml/2006/main" noChangeAspect="1"/>
+            </wp:cNvGraphicFramePr>
+            <a:graphic xmlns:a="http://schemas.openxmlformats.org/drawingml/2006/main">
+              <a:graphicData uri="http://schemas.openxmlformats.org/drawingml/2006/picture">
+                <pic:pic xmlns:pic="http://schemas.openxmlformats.org/drawingml/2006/picture">
+                  <pic:nvPicPr>
+                    <pic:cNvPr id="0" name="Picture 11"/>
+                    <pic:cNvPicPr>
+                      <a:picLocks noChangeAspect="1" noChangeArrowheads="1"/>
+                    </pic:cNvPicPr>
+                  </pic:nvPicPr>
+                  <pic:blipFill>
+                    <a:blip r:embed="rId4" cstate="print">
+                      <a:extLst>
+                        <a:ext uri="{28A0092B-C50C-407E-A947-70E740481C1C}">
+                          <a14:useLocalDpi xmlns:a14="http://schemas.microsoft.com/office/drawing/2010/main" val="0"/>
+                        </a:ext>
+                      </a:extLst>
+                    </a:blip>
+                    <a:srcRect/>
+                    <a:stretch>
+                      <a:fillRect/>
+                    </a:stretch>
+                  </pic:blipFill>
+                  <pic:spPr bwMode="auto">
+                    <a:xfrm>
+                      <a:off x="0" y="0"/>
+                      <a:ext cx="5943600" cy="944880"/>
+                    </a:xfrm>
+                    <a:prstGeom prst="rect">
+                      <a:avLst/>
+                    </a:prstGeom>
+                    <a:noFill/>
+                    <a:ln>
+                      <a:noFill/>
+                    </a:ln>
+                  </pic:spPr>
+                </pic:pic>
+              </a:graphicData>
+            </a:graphic>
+          </wp:inline>
+        </w:drawing>
+      </w:r>
+    </w:p>
+    <w:p>
       <w:pPr>
         <w:pStyle w:val="Heading3"/>
         <w:keepNext w:val="0"/>
@@ -289,16 +370,33 @@
           <w:sz w:val="26"/>
           <w:szCs w:val="26"/>
         </w:rPr>
-        <w:lastRenderedPageBreak/>
         <w:t>Container Diagram Explanation</w:t>
       </w:r>
     </w:p>
     <w:p>
       <w:pPr>
-        <w:spacing w:before="240" w:after="240"/>
+        <w:ind w:firstLine="720"/>
       </w:pPr>
       <w:r>
-        <w:t>//text here</w:t>
+        <w:t>The Web Frontend provides interfaces the both the regular users and administrators use. It displays queue position, estimated wait time, history, available services, and administrator management tools. The frontend sends user actions directly to the backend, without directly changing application data.</w:t>
+      </w:r>
+    </w:p>
+    <w:p>
+      <w:r>
+        <w:tab/>
+        <w:t>The Backend/API contains all main application logic. It authenticates users, manages services, processes join and leave requests, checks whether a user has the permissions of a regular user or an administrator, orders queue entries by arrival time and priority, computes estimated wait time of requests, prepares basic usage statistics, and records the queue history.</w:t>
+      </w:r>
+    </w:p>
+    <w:p>
+      <w:r>
+        <w:tab/>
+        <w:t>The Notification Module receives notification events directly from the backend. For instance, when a user becomes close to the front of the queue, the backend may trigger a notification event. This notification module can then use the external email service to deliver the message to the user. Additionally, in-app notifications can be shown directly through the web application.</w:t>
+      </w:r>
+    </w:p>
+    <w:p>
+      <w:r>
+        <w:tab/>
+        <w:t>The Database stores persistent information, such as user accounts, services, roles, active queue entries, queue participation history, and priority information. Keeping this information in one data store allows the system to maintain queue state, even if a user closes their browser.</w:t>
       </w:r>
     </w:p>
     <w:p>
@@ -579,6 +677,7 @@
           </w:tcPr>
           <w:p>
             <w:r>
+              <w:lastRenderedPageBreak/>
               <w:t>Alan Garcia</w:t>
             </w:r>
           </w:p>
@@ -650,7 +749,7 @@
           </w:tcPr>
           <w:p>
             <w:r>
-              <w:t>Member 3</w:t>
+              <w:t>Chase Beeler</w:t>
             </w:r>
           </w:p>
         </w:tc>
@@ -1296,7 +1395,6 @@
   <w:style w:type="character" w:default="1" w:styleId="DefaultParagraphFont">
     <w:name w:val="Default Paragraph Font"/>
     <w:uiPriority w:val="1"/>
-    <w:semiHidden/>
     <w:unhideWhenUsed/>
   </w:style>
   <w:style w:type="table" w:default="1" w:styleId="TableNormal">

</xml_diff>

<commit_message>
Answered the Initial Thoughts Questions
</commit_message>
<xml_diff>
--- a/Assignment 1_ Initial Thoughts and System Design (A1).docx
+++ b/Assignment 1_ Initial Thoughts and System Design (A1).docx
@@ -15,8 +15,7 @@
           <w:szCs w:val="46"/>
         </w:rPr>
       </w:pPr>
-      <w:bookmarkStart w:id="0" w:name="_w4ex58b5ecvo" w:colFirst="0" w:colLast="0"/>
-      <w:bookmarkEnd w:id="0"/>
+      <w:bookmarkStart w:id="0" w:name="_w4ex58b5ecvo"/>
       <w:r>
         <w:rPr>
           <w:b/>
@@ -26,6 +25,7 @@
         </w:rPr>
         <w:t>Assignment 1: Initial Thoughts and System Design (A1)</w:t>
       </w:r>
+      <w:bookmarkEnd w:id="0"/>
     </w:p>
     <w:p>
       <w:pPr>
@@ -40,8 +40,8 @@
           <w:szCs w:val="34"/>
         </w:rPr>
       </w:pPr>
-      <w:bookmarkStart w:id="1" w:name="_o2lkjt5mhw88" w:colFirst="0" w:colLast="0"/>
-      <w:bookmarkEnd w:id="1"/>
+      <w:bookmarkStart w:id="1" w:name="_o2lkjt5mhw88"/>
+      <w:proofErr w:type="spellStart"/>
       <w:r>
         <w:rPr>
           <w:b/>
@@ -49,8 +49,19 @@
           <w:sz w:val="34"/>
           <w:szCs w:val="34"/>
         </w:rPr>
-        <w:t>QueueSmart – Smart Queue Management Application</w:t>
-      </w:r>
+        <w:t>QueueSmart</w:t>
+      </w:r>
+      <w:proofErr w:type="spellEnd"/>
+      <w:r>
+        <w:rPr>
+          <w:b/>
+          <w:bCs/>
+          <w:sz w:val="34"/>
+          <w:szCs w:val="34"/>
+        </w:rPr>
+        <w:t xml:space="preserve"> – Smart Queue Management Application</w:t>
+      </w:r>
+      <w:bookmarkEnd w:id="1"/>
     </w:p>
     <w:p>
       <w:pPr>
@@ -65,8 +76,7 @@
           <w:szCs w:val="34"/>
         </w:rPr>
       </w:pPr>
-      <w:bookmarkStart w:id="2" w:name="_k30j8ll6szyj" w:colFirst="0" w:colLast="0"/>
-      <w:bookmarkEnd w:id="2"/>
+      <w:bookmarkStart w:id="2" w:name="_k30j8ll6szyj"/>
       <w:r>
         <w:rPr>
           <w:b/>
@@ -76,22 +86,358 @@
         </w:rPr>
         <w:t>1. Initial Thoughts</w:t>
       </w:r>
-    </w:p>
-    <w:p>
-      <w:pPr>
-        <w:spacing w:before="240" w:after="240"/>
-      </w:pPr>
-      <w:r>
-        <w:t>//text here</w:t>
-      </w:r>
-    </w:p>
-    <w:p>
-      <w:r>
-        <w:pict w14:anchorId="406EBC06">
-          <v:rect id="_x0000_i1025" style="width:0;height:1.5pt" o:hralign="center" o:hrstd="t" o:hr="t" fillcolor="#a0a0a0" stroked="f"/>
-        </w:pict>
-      </w:r>
-    </w:p>
+      <w:bookmarkEnd w:id="2"/>
+    </w:p>
+    <w:p>
+      <w:pPr>
+        <w:rPr>
+          <w:lang w:val="en-US"/>
+        </w:rPr>
+      </w:pPr>
+      <w:r>
+        <w:rPr>
+          <w:lang w:val="en-US"/>
+        </w:rPr>
+        <w:t>1. Who are the main users of the system?</w:t>
+      </w:r>
+    </w:p>
+    <w:p>
+      <w:pPr>
+        <w:rPr>
+          <w:lang w:val="en-US"/>
+        </w:rPr>
+      </w:pPr>
+    </w:p>
+    <w:p>
+      <w:pPr>
+        <w:rPr>
+          <w:lang w:val="en-US"/>
+        </w:rPr>
+      </w:pPr>
+      <w:r>
+        <w:rPr>
+          <w:lang w:val="en-US"/>
+        </w:rPr>
+        <w:t xml:space="preserve">There will be two categories of users in </w:t>
+      </w:r>
+      <w:proofErr w:type="spellStart"/>
+      <w:r>
+        <w:rPr>
+          <w:lang w:val="en-US"/>
+        </w:rPr>
+        <w:t>QueueSmart</w:t>
+      </w:r>
+      <w:proofErr w:type="spellEnd"/>
+      <w:r>
+        <w:rPr>
+          <w:lang w:val="en-US"/>
+        </w:rPr>
+        <w:t xml:space="preserve">, Users, and </w:t>
+      </w:r>
+      <w:proofErr w:type="spellStart"/>
+      <w:r>
+        <w:rPr>
+          <w:lang w:val="en-US"/>
+        </w:rPr>
+        <w:t>Administors</w:t>
+      </w:r>
+      <w:proofErr w:type="spellEnd"/>
+      <w:r>
+        <w:rPr>
+          <w:lang w:val="en-US"/>
+        </w:rPr>
+        <w:t xml:space="preserve">. Possible users include students, customers, and patients who need to schedule a service/appointment to avoid a physical line. Administrators will work with </w:t>
+      </w:r>
+      <w:proofErr w:type="spellStart"/>
+      <w:r>
+        <w:rPr>
+          <w:lang w:val="en-US"/>
+        </w:rPr>
+        <w:t>QueueSmart</w:t>
+      </w:r>
+      <w:proofErr w:type="spellEnd"/>
+      <w:r>
+        <w:rPr>
+          <w:lang w:val="en-US"/>
+        </w:rPr>
+        <w:t xml:space="preserve"> and Users/Customers to provide them with their service as seamlessly as possible.</w:t>
+      </w:r>
+    </w:p>
+    <w:p>
+      <w:pPr>
+        <w:rPr>
+          <w:lang w:val="en-US"/>
+        </w:rPr>
+      </w:pPr>
+    </w:p>
+    <w:p>
+      <w:pPr>
+        <w:rPr>
+          <w:lang w:val="en-US"/>
+        </w:rPr>
+      </w:pPr>
+      <w:r>
+        <w:rPr>
+          <w:lang w:val="en-US"/>
+        </w:rPr>
+        <w:t>2. How will users and administrators interact with the application?</w:t>
+      </w:r>
+    </w:p>
+    <w:p>
+      <w:pPr>
+        <w:rPr>
+          <w:lang w:val="en-US"/>
+        </w:rPr>
+      </w:pPr>
+    </w:p>
+    <w:p>
+      <w:pPr>
+        <w:rPr>
+          <w:lang w:val="en-US"/>
+        </w:rPr>
+      </w:pPr>
+      <w:r>
+        <w:rPr>
+          <w:lang w:val="en-US"/>
+        </w:rPr>
+        <w:t xml:space="preserve">Both users and administrators will be able to register and login to the application. For users, logging in will allow them to browse and select a service to join a queue. They should be able to see their estimated </w:t>
+      </w:r>
+      <w:proofErr w:type="gramStart"/>
+      <w:r>
+        <w:rPr>
+          <w:lang w:val="en-US"/>
+        </w:rPr>
+        <w:t>wait</w:t>
+      </w:r>
+      <w:proofErr w:type="gramEnd"/>
+      <w:r>
+        <w:rPr>
+          <w:lang w:val="en-US"/>
+        </w:rPr>
+        <w:t xml:space="preserve"> time, leave the queue, and check in once an administrator is ready for them. Users should also receive a notification once their wait is over. For admins, they should be able to create and manage services, see who is in the queue in real time and manually adjust the queue and users as necessary. They should also be able to </w:t>
+      </w:r>
+      <w:proofErr w:type="gramStart"/>
+      <w:r>
+        <w:rPr>
+          <w:lang w:val="en-US"/>
+        </w:rPr>
+        <w:t>view user</w:t>
+      </w:r>
+      <w:proofErr w:type="gramEnd"/>
+      <w:r>
+        <w:rPr>
+          <w:lang w:val="en-US"/>
+        </w:rPr>
+        <w:t xml:space="preserve"> historical data that is relevant to their service.</w:t>
+      </w:r>
+    </w:p>
+    <w:p>
+      <w:pPr>
+        <w:rPr>
+          <w:lang w:val="en-US"/>
+        </w:rPr>
+      </w:pPr>
+    </w:p>
+    <w:p>
+      <w:pPr>
+        <w:rPr>
+          <w:lang w:val="en-US"/>
+        </w:rPr>
+      </w:pPr>
+      <w:r>
+        <w:rPr>
+          <w:lang w:val="en-US"/>
+        </w:rPr>
+        <w:t>3. What are the most important features?</w:t>
+      </w:r>
+    </w:p>
+    <w:p>
+      <w:pPr>
+        <w:rPr>
+          <w:lang w:val="en-US"/>
+        </w:rPr>
+      </w:pPr>
+    </w:p>
+    <w:p>
+      <w:pPr>
+        <w:rPr>
+          <w:lang w:val="en-US"/>
+        </w:rPr>
+      </w:pPr>
+      <w:r>
+        <w:rPr>
+          <w:lang w:val="en-US"/>
+        </w:rPr>
+        <w:t xml:space="preserve">The most important feature for </w:t>
+      </w:r>
+      <w:proofErr w:type="spellStart"/>
+      <w:r>
+        <w:rPr>
+          <w:lang w:val="en-US"/>
+        </w:rPr>
+        <w:t>QueueSmart</w:t>
+      </w:r>
+      <w:proofErr w:type="spellEnd"/>
+      <w:r>
+        <w:rPr>
+          <w:lang w:val="en-US"/>
+        </w:rPr>
+        <w:t xml:space="preserve"> is for users to be able to easily </w:t>
+      </w:r>
+      <w:proofErr w:type="gramStart"/>
+      <w:r>
+        <w:rPr>
+          <w:lang w:val="en-US"/>
+        </w:rPr>
+        <w:t>login</w:t>
+      </w:r>
+      <w:proofErr w:type="gramEnd"/>
+      <w:r>
+        <w:rPr>
+          <w:lang w:val="en-US"/>
+        </w:rPr>
+        <w:t xml:space="preserve">, choose a service and see their queue position and estimated wait time. Without these basic functions being easily accessible by a </w:t>
+      </w:r>
+      <w:proofErr w:type="gramStart"/>
+      <w:r>
+        <w:rPr>
+          <w:lang w:val="en-US"/>
+        </w:rPr>
+        <w:t>first time</w:t>
+      </w:r>
+      <w:proofErr w:type="gramEnd"/>
+      <w:r>
+        <w:rPr>
+          <w:lang w:val="en-US"/>
+        </w:rPr>
+        <w:t xml:space="preserve"> user, there is no point in using </w:t>
+      </w:r>
+      <w:proofErr w:type="spellStart"/>
+      <w:r>
+        <w:rPr>
+          <w:lang w:val="en-US"/>
+        </w:rPr>
+        <w:t>QueueSmart</w:t>
+      </w:r>
+      <w:proofErr w:type="spellEnd"/>
+      <w:r>
+        <w:rPr>
+          <w:lang w:val="en-US"/>
+        </w:rPr>
+        <w:t xml:space="preserve">. Notifications also need to be </w:t>
+      </w:r>
+      <w:proofErr w:type="gramStart"/>
+      <w:r>
+        <w:rPr>
+          <w:lang w:val="en-US"/>
+        </w:rPr>
+        <w:t>accurate,</w:t>
+      </w:r>
+      <w:proofErr w:type="gramEnd"/>
+      <w:r>
+        <w:rPr>
+          <w:lang w:val="en-US"/>
+        </w:rPr>
+        <w:t xml:space="preserve"> users should only receive </w:t>
+      </w:r>
+      <w:proofErr w:type="gramStart"/>
+      <w:r>
+        <w:rPr>
+          <w:lang w:val="en-US"/>
+        </w:rPr>
+        <w:t>a notification</w:t>
+      </w:r>
+      <w:proofErr w:type="gramEnd"/>
+      <w:r>
+        <w:rPr>
+          <w:lang w:val="en-US"/>
+        </w:rPr>
+        <w:t xml:space="preserve"> if admins are ready for a user to check in. On the admin side, they should be able to easily add services and have the right amount of configuration options.</w:t>
+      </w:r>
+    </w:p>
+    <w:p>
+      <w:pPr>
+        <w:rPr>
+          <w:lang w:val="en-US"/>
+        </w:rPr>
+      </w:pPr>
+    </w:p>
+    <w:p>
+      <w:pPr>
+        <w:rPr>
+          <w:lang w:val="en-US"/>
+        </w:rPr>
+      </w:pPr>
+      <w:r>
+        <w:rPr>
+          <w:lang w:val="en-US"/>
+        </w:rPr>
+        <w:t>4. What challenges do you anticipate?</w:t>
+      </w:r>
+    </w:p>
+    <w:p>
+      <w:pPr>
+        <w:rPr>
+          <w:lang w:val="en-US"/>
+        </w:rPr>
+      </w:pPr>
+      <w:r>
+        <w:rPr>
+          <w:lang w:val="en-US"/>
+        </w:rPr>
+        <w:t xml:space="preserve">Some challenges that I expect are being able to accurately determine wait time, reliability of notifications and management of customers not being present and cancelling. Service duration can vary a lot which can disrupt the accuracy of wait time. </w:t>
+      </w:r>
+      <w:proofErr w:type="gramStart"/>
+      <w:r>
+        <w:rPr>
+          <w:lang w:val="en-US"/>
+        </w:rPr>
+        <w:t>A service</w:t>
+      </w:r>
+      <w:proofErr w:type="gramEnd"/>
+      <w:r>
+        <w:rPr>
+          <w:lang w:val="en-US"/>
+        </w:rPr>
+        <w:t xml:space="preserve"> may take longer depending on the time of day, the workers present, etc. I also think the scalability of the program can be a major issue, </w:t>
+      </w:r>
+      <w:proofErr w:type="spellStart"/>
+      <w:r>
+        <w:rPr>
+          <w:lang w:val="en-US"/>
+        </w:rPr>
+        <w:t>QueueSmart</w:t>
+      </w:r>
+      <w:proofErr w:type="spellEnd"/>
+      <w:r>
+        <w:rPr>
+          <w:lang w:val="en-US"/>
+        </w:rPr>
+        <w:t xml:space="preserve"> needs to be able to handle a lot of simultaneous queues. The </w:t>
+      </w:r>
+      <w:r>
+        <w:rPr>
+          <w:lang w:val="en-US"/>
+        </w:rPr>
+        <w:lastRenderedPageBreak/>
+        <w:t xml:space="preserve">program crashing/being dysfunctional can cause major issues for companies using </w:t>
+      </w:r>
+      <w:proofErr w:type="spellStart"/>
+      <w:r>
+        <w:rPr>
+          <w:lang w:val="en-US"/>
+        </w:rPr>
+        <w:t>QueueSmart</w:t>
+      </w:r>
+      <w:proofErr w:type="spellEnd"/>
+      <w:r>
+        <w:rPr>
+          <w:lang w:val="en-US"/>
+        </w:rPr>
+        <w:t>.</w:t>
+      </w:r>
+    </w:p>
+    <w:p/>
     <w:p>
       <w:pPr>
         <w:pStyle w:val="Heading2"/>
@@ -105,8 +451,7 @@
           <w:szCs w:val="34"/>
         </w:rPr>
       </w:pPr>
-      <w:bookmarkStart w:id="3" w:name="_68llr56wlds4" w:colFirst="0" w:colLast="0"/>
-      <w:bookmarkEnd w:id="3"/>
+      <w:bookmarkStart w:id="3" w:name="_68llr56wlds4"/>
       <w:r>
         <w:rPr>
           <w:b/>
@@ -116,16 +461,14 @@
         </w:rPr>
         <w:t>2. Development Methodology</w:t>
       </w:r>
+      <w:bookmarkEnd w:id="3"/>
     </w:p>
     <w:p>
       <w:pPr>
         <w:ind w:firstLine="720"/>
       </w:pPr>
       <w:r>
-        <w:t>For this project we will be using the SCRUM development methodology. Scrum is an agile framework that divides the work into multiple sections called sprints. This allows us to build the project through iterative updates while giving us the flexibility of adjusting our design at any point during the process if changes are required. This is ideal for our project which is split into multiple assignments that require us to build our application piece by piece. Every work cycle will require us to evenly split the work amongst our group, execute our plan, receive feedback, and continuously improve our application.</w:t>
-      </w:r>
-      <w:r>
-        <w:t xml:space="preserve"> </w:t>
+        <w:t xml:space="preserve">For this project we will be using the SCRUM development methodology. Scrum is an agile framework that divides the work into multiple sections called sprints. This allows us to build the project through iterative updates while giving us the flexibility of adjusting our design at any point during the process if changes are required. This is ideal for our project which is split into multiple assignments that require us to build our application piece by piece. Every work cycle will require us to evenly split the work amongst our group, execute our plan, receive feedback, and continuously improve our application. </w:t>
       </w:r>
     </w:p>
     <w:p>
@@ -133,15 +476,23 @@
         <w:ind w:firstLine="720"/>
       </w:pPr>
       <w:r>
-        <w:t>By using a shared repository on GitHub we can coordinate our work efficiently and have a record of our individual contributions for each cycle of the project.</w:t>
-      </w:r>
-      <w:r>
-        <w:t xml:space="preserve"> With everyone involved in every cycle, everyone becomes familiar with every section of the application which facilitates communication within our group. </w:t>
-      </w:r>
-      <w:r>
-        <w:pict w14:anchorId="5AF3AA6A">
-          <v:rect id="_x0000_i1026" style="width:0;height:1.5pt" o:hralign="center" o:hrstd="t" o:hr="t" fillcolor="#a0a0a0" stroked="f"/>
-        </w:pict>
+        <w:t xml:space="preserve">By using a shared repository on </w:t>
+      </w:r>
+      <w:proofErr w:type="gramStart"/>
+      <w:r>
+        <w:t>GitHub</w:t>
+      </w:r>
+      <w:proofErr w:type="gramEnd"/>
+      <w:r>
+        <w:t xml:space="preserve"> we can coordinate our work efficiently and have a record of our individual contributions for each </w:t>
+      </w:r>
+      <w:proofErr w:type="gramStart"/>
+      <w:r>
+        <w:t>cycle of the project</w:t>
+      </w:r>
+      <w:proofErr w:type="gramEnd"/>
+      <w:r>
+        <w:t xml:space="preserve">. With everyone involved in every cycle, everyone becomes familiar with every section of the application which facilitates communication within our group. </w:t>
       </w:r>
     </w:p>
     <w:p>
@@ -157,8 +508,7 @@
           <w:szCs w:val="34"/>
         </w:rPr>
       </w:pPr>
-      <w:bookmarkStart w:id="4" w:name="_539jdmilwa40" w:colFirst="0" w:colLast="0"/>
-      <w:bookmarkEnd w:id="4"/>
+      <w:bookmarkStart w:id="4" w:name="_539jdmilwa40"/>
       <w:r>
         <w:rPr>
           <w:b/>
@@ -168,6 +518,7 @@
         </w:rPr>
         <w:t>3. High-Level Design / Architecture</w:t>
       </w:r>
+      <w:bookmarkEnd w:id="4"/>
     </w:p>
     <w:p>
       <w:pPr>
@@ -183,8 +534,7 @@
           <w:szCs w:val="26"/>
         </w:rPr>
       </w:pPr>
-      <w:bookmarkStart w:id="5" w:name="_n9rkqy14gmc1" w:colFirst="0" w:colLast="0"/>
-      <w:bookmarkEnd w:id="5"/>
+      <w:bookmarkStart w:id="5" w:name="_n9rkqy14gmc1"/>
       <w:r>
         <w:rPr>
           <w:b/>
@@ -195,6 +545,7 @@
         </w:rPr>
         <w:t>3.1 System Context Diagram</w:t>
       </w:r>
+      <w:bookmarkEnd w:id="5"/>
     </w:p>
     <w:p/>
     <w:p>
@@ -211,8 +562,7 @@
           <w:szCs w:val="26"/>
         </w:rPr>
       </w:pPr>
-      <w:bookmarkStart w:id="6" w:name="_mr012098t7d3" w:colFirst="0" w:colLast="0"/>
-      <w:bookmarkEnd w:id="6"/>
+      <w:bookmarkStart w:id="6" w:name="_mr012098t7d3"/>
       <w:r>
         <w:rPr>
           <w:b/>
@@ -223,19 +573,14 @@
         </w:rPr>
         <w:t>System Context Explanation</w:t>
       </w:r>
+      <w:bookmarkEnd w:id="6"/>
     </w:p>
     <w:p>
       <w:r>
         <w:t>//text here</w:t>
       </w:r>
     </w:p>
-    <w:p>
-      <w:r>
-        <w:pict w14:anchorId="67D5834B">
-          <v:rect id="_x0000_i1027" style="width:0;height:1.5pt" o:hralign="center" o:hrstd="t" o:hr="t" fillcolor="#a0a0a0" stroked="f"/>
-        </w:pict>
-      </w:r>
-    </w:p>
+    <w:p/>
     <w:p>
       <w:pPr>
         <w:pStyle w:val="Heading3"/>
@@ -250,8 +595,7 @@
           <w:szCs w:val="26"/>
         </w:rPr>
       </w:pPr>
-      <w:bookmarkStart w:id="7" w:name="_y8o0qr9cv2q4" w:colFirst="0" w:colLast="0"/>
-      <w:bookmarkEnd w:id="7"/>
+      <w:bookmarkStart w:id="7" w:name="_y8o0qr9cv2q4"/>
       <w:r>
         <w:rPr>
           <w:b/>
@@ -262,18 +606,18 @@
         </w:rPr>
         <w:t>3.2 Optional Container Diagram</w:t>
       </w:r>
-    </w:p>
-    <w:p>
-      <w:r>
-        <w:rPr>
-          <w:lang w:val="en-US"/>
-        </w:rPr>
-        <w:lastRenderedPageBreak/>
+      <w:bookmarkEnd w:id="7"/>
+    </w:p>
+    <w:p>
+      <w:r>
+        <w:rPr>
+          <w:noProof/>
+        </w:rPr>
         <w:drawing>
-          <wp:inline distT="0" distB="0" distL="0" distR="0" wp14:anchorId="49E371E0" wp14:editId="2431EB25">
-            <wp:extent cx="5943600" cy="944880"/>
-            <wp:effectExtent l="0" t="0" r="0" b="7620"/>
-            <wp:docPr id="1623405986" name="Picture 2"/>
+          <wp:inline distT="0" distB="0" distL="0" distR="0" wp14:anchorId="75ED8BE9" wp14:editId="351D6833">
+            <wp:extent cx="5943600" cy="942975"/>
+            <wp:effectExtent l="0" t="0" r="0" b="9525"/>
+            <wp:docPr id="100000" name="Picture 100000"/>
             <wp:cNvGraphicFramePr>
               <a:graphicFrameLocks xmlns:a="http://schemas.openxmlformats.org/drawingml/2006/main" noChangeAspect="1"/>
             </wp:cNvGraphicFramePr>
@@ -281,36 +625,23 @@
               <a:graphicData uri="http://schemas.openxmlformats.org/drawingml/2006/picture">
                 <pic:pic xmlns:pic="http://schemas.openxmlformats.org/drawingml/2006/picture">
                   <pic:nvPicPr>
-                    <pic:cNvPr id="0" name="Picture 11"/>
-                    <pic:cNvPicPr>
-                      <a:picLocks noChangeAspect="1" noChangeArrowheads="1"/>
-                    </pic:cNvPicPr>
+                    <pic:cNvPr id="100000" name="image100000"/>
+                    <pic:cNvPicPr/>
                   </pic:nvPicPr>
                   <pic:blipFill>
-                    <a:blip r:embed="rId5" cstate="print">
-                      <a:extLst>
-                        <a:ext uri="{28A0092B-C50C-407E-A947-70E740481C1C}">
-                          <a14:useLocalDpi xmlns:a14="http://schemas.microsoft.com/office/drawing/2010/main" val="0"/>
-                        </a:ext>
-                      </a:extLst>
-                    </a:blip>
-                    <a:srcRect/>
+                    <a:blip r:embed="rId5"/>
                     <a:stretch>
                       <a:fillRect/>
                     </a:stretch>
                   </pic:blipFill>
-                  <pic:spPr bwMode="auto">
+                  <pic:spPr>
                     <a:xfrm>
                       <a:off x="0" y="0"/>
-                      <a:ext cx="5943600" cy="944880"/>
+                      <a:ext cx="5943600" cy="942975"/>
                     </a:xfrm>
                     <a:prstGeom prst="rect">
                       <a:avLst/>
                     </a:prstGeom>
-                    <a:noFill/>
-                    <a:ln>
-                      <a:noFill/>
-                    </a:ln>
                   </pic:spPr>
                 </pic:pic>
               </a:graphicData>
@@ -333,8 +664,7 @@
           <w:szCs w:val="26"/>
         </w:rPr>
       </w:pPr>
-      <w:bookmarkStart w:id="8" w:name="_1ybz22a7dtl" w:colFirst="0" w:colLast="0"/>
-      <w:bookmarkEnd w:id="8"/>
+      <w:bookmarkStart w:id="8" w:name="_1ybz22a7dtl"/>
       <w:r>
         <w:rPr>
           <w:b/>
@@ -345,25 +675,32 @@
         </w:rPr>
         <w:t>Container Diagram Explanation</w:t>
       </w:r>
+      <w:bookmarkEnd w:id="8"/>
     </w:p>
     <w:p>
       <w:pPr>
         <w:ind w:firstLine="720"/>
       </w:pPr>
       <w:r>
-        <w:t xml:space="preserve">The Web Frontend provides interfaces </w:t>
-      </w:r>
-      <w:r>
-        <w:t>to</w:t>
-      </w:r>
-      <w:r>
-        <w:t xml:space="preserve"> both the regular users and administrators use. It displays queue position, estimated wait time, history, available services, and administrator management tools. The frontend sends user actions directly to the backend, without directly changing application data.</w:t>
+        <w:t xml:space="preserve">The Web Frontend provides interfaces to both the regular users and </w:t>
+      </w:r>
+      <w:proofErr w:type="gramStart"/>
+      <w:r>
+        <w:t>administrators use</w:t>
+      </w:r>
+      <w:proofErr w:type="gramEnd"/>
+      <w:r>
+        <w:t>. It displays queue position, estimated wait time, history, available services, and administrator management tools. The frontend sends user actions directly to the backend, without directly changing application data.</w:t>
       </w:r>
     </w:p>
     <w:p>
       <w:r>
         <w:tab/>
-        <w:t>The Backend/API contains all main application logic. It authenticates users, manages services, processes join and leave requests, checks whether a user has the permissions of a regular user or an administrator, orders queue entries by arrival time and priority, computes estimated wait time of requests, prepares basic usage statistics, and records the queue history.</w:t>
+        <w:t xml:space="preserve">The Backend/API contains all main application logic. It authenticates users, manages services, processes join and leave requests, checks whether a user has the permissions of a </w:t>
+      </w:r>
+      <w:r>
+        <w:lastRenderedPageBreak/>
+        <w:t>regular user or an administrator, orders queue entries by arrival time and priority, computes estimated wait time of requests, prepares basic usage statistics, and records the queue history.</w:t>
       </w:r>
     </w:p>
     <w:p>
@@ -378,13 +715,7 @@
         <w:t>The Database stores persistent information, such as user accounts, services, roles, active queue entries, queue participation history, and priority information. Keeping this information in one data store allows the system to maintain queue state, even if a user closes their browser.</w:t>
       </w:r>
     </w:p>
-    <w:p>
-      <w:r>
-        <w:pict w14:anchorId="339AD95F">
-          <v:rect id="_x0000_i1028" style="width:0;height:1.5pt" o:hralign="center" o:hrstd="t" o:hr="t" fillcolor="#a0a0a0" stroked="f"/>
-        </w:pict>
-      </w:r>
-    </w:p>
+    <w:p/>
     <w:p>
       <w:pPr>
         <w:pStyle w:val="Heading2"/>
@@ -398,8 +729,7 @@
           <w:szCs w:val="34"/>
         </w:rPr>
       </w:pPr>
-      <w:bookmarkStart w:id="9" w:name="_fanei6xsgk9" w:colFirst="0" w:colLast="0"/>
-      <w:bookmarkEnd w:id="9"/>
+      <w:bookmarkStart w:id="9" w:name="_fanei6xsgk9"/>
       <w:r>
         <w:rPr>
           <w:b/>
@@ -409,13 +739,22 @@
         </w:rPr>
         <w:t>4. Major Component Interaction Summary</w:t>
       </w:r>
+      <w:bookmarkEnd w:id="9"/>
     </w:p>
     <w:p>
       <w:pPr>
         <w:spacing w:before="240" w:after="240"/>
       </w:pPr>
       <w:r>
-        <w:t>A typical QueueSmart interaction works like this:</w:t>
+        <w:t xml:space="preserve">A typical </w:t>
+      </w:r>
+      <w:proofErr w:type="spellStart"/>
+      <w:r>
+        <w:t>QueueSmart</w:t>
+      </w:r>
+      <w:proofErr w:type="spellEnd"/>
+      <w:r>
+        <w:t xml:space="preserve"> interaction works like this:</w:t>
       </w:r>
     </w:p>
     <w:p>
@@ -428,7 +767,15 @@
         <w:spacing w:before="240" w:after="240"/>
       </w:pPr>
       <w:r>
-        <w:t>User or Administrator logs into the web application of QueueSmart.</w:t>
+        <w:t xml:space="preserve">User or Administrator logs into the web application of </w:t>
+      </w:r>
+      <w:proofErr w:type="spellStart"/>
+      <w:r>
+        <w:t>QueueSmart</w:t>
+      </w:r>
+      <w:proofErr w:type="spellEnd"/>
+      <w:r>
+        <w:t>.</w:t>
       </w:r>
     </w:p>
     <w:p>
@@ -519,7 +866,15 @@
         <w:spacing w:before="240" w:after="240"/>
       </w:pPr>
       <w:r>
-        <w:t>When service completed or user leaves queue, system updates active queue and saves the result in history.</w:t>
+        <w:t xml:space="preserve">When service </w:t>
+      </w:r>
+      <w:proofErr w:type="gramStart"/>
+      <w:r>
+        <w:t>completed</w:t>
+      </w:r>
+      <w:proofErr w:type="gramEnd"/>
+      <w:r>
+        <w:t xml:space="preserve"> or user leaves queue, system updates active queue and saves the result in history.</w:t>
       </w:r>
     </w:p>
     <w:p>
@@ -540,17 +895,10 @@
         <w:spacing w:before="240" w:after="240"/>
       </w:pPr>
       <w:r>
-        <w:lastRenderedPageBreak/>
         <w:t>This design keeps the web application simple enough for the first stage of the project, and leaves room for later assignments to define things like the UI, APIs, and database structure with more detail.</w:t>
       </w:r>
     </w:p>
-    <w:p>
-      <w:r>
-        <w:pict w14:anchorId="1EF63B7A">
-          <v:rect id="_x0000_i1029" style="width:0;height:1.5pt" o:hralign="center" o:hrstd="t" o:hr="t" fillcolor="#a0a0a0" stroked="f"/>
-        </w:pict>
-      </w:r>
-    </w:p>
+    <w:p/>
     <w:p>
       <w:pPr>
         <w:pStyle w:val="Heading2"/>
@@ -564,8 +912,7 @@
           <w:szCs w:val="34"/>
         </w:rPr>
       </w:pPr>
-      <w:bookmarkStart w:id="10" w:name="_pd330yj8v2k7" w:colFirst="0" w:colLast="0"/>
-      <w:bookmarkEnd w:id="10"/>
+      <w:bookmarkStart w:id="10" w:name="_pd330yj8v2k7"/>
       <w:r>
         <w:rPr>
           <w:b/>
@@ -575,6 +922,7 @@
         </w:rPr>
         <w:t>5. Team Contributions</w:t>
       </w:r>
+      <w:bookmarkEnd w:id="10"/>
     </w:p>
     <w:tbl>
       <w:tblPr>
@@ -590,7 +938,7 @@
           <w:insideV w:val="nil"/>
         </w:tblBorders>
         <w:tblLayout w:type="fixed"/>
-        <w:tblLook w:val="0600" w:firstRow="0" w:lastRow="0" w:firstColumn="0" w:lastColumn="0" w:noHBand="1" w:noVBand="1"/>
+        <w:tblLook w:val="07E0" w:firstRow="1" w:lastRow="1" w:firstColumn="1" w:lastColumn="1" w:noHBand="1" w:noVBand="1"/>
       </w:tblPr>
       <w:tblGrid>
         <w:gridCol w:w="1260"/>
@@ -711,6 +1059,7 @@
           </w:tcPr>
           <w:p>
             <w:r>
+              <w:lastRenderedPageBreak/>
               <w:t>Jeremy Yang</w:t>
             </w:r>
           </w:p>
@@ -978,7 +1327,6 @@
     <w:sectPr>
       <w:pgSz w:w="12240" w:h="15840"/>
       <w:pgMar w:top="1440" w:right="1440" w:bottom="1440" w:left="1440" w:header="720" w:footer="720" w:gutter="0"/>
-      <w:pgNumType w:start="1"/>
       <w:cols w:space="720"/>
     </w:sectPr>
   </w:body>
@@ -1682,6 +2030,17 @@
       <w:contextualSpacing/>
     </w:pPr>
   </w:style>
+  <w:style w:type="character" w:styleId="Hyperlink">
+    <w:name w:val="Hyperlink"/>
+    <w:basedOn w:val="DefaultParagraphFont"/>
+    <w:uiPriority w:val="99"/>
+    <w:unhideWhenUsed/>
+    <w:rsid w:val="00D87CC4"/>
+    <w:rPr>
+      <w:color w:val="0000FF" w:themeColor="hyperlink"/>
+      <w:u w:val="single"/>
+    </w:rPr>
+  </w:style>
 </w:styles>
 </file>
 

</xml_diff>

<commit_message>
Touching up initial thoughts and ensured consistency
</commit_message>
<xml_diff>
--- a/Assignment 1_ Initial Thoughts and System Design (A1).docx
+++ b/Assignment 1_ Initial Thoughts and System Design (A1).docx
@@ -41,7 +41,6 @@
         </w:rPr>
       </w:pPr>
       <w:bookmarkStart w:id="1" w:name="_o2lkjt5mhw88"/>
-      <w:proofErr w:type="spellStart"/>
       <w:r>
         <w:rPr>
           <w:b/>
@@ -49,20 +48,544 @@
           <w:sz w:val="34"/>
           <w:szCs w:val="34"/>
         </w:rPr>
-        <w:t>QueueSmart</w:t>
-      </w:r>
-      <w:proofErr w:type="spellEnd"/>
-      <w:r>
+        <w:t>QueueSmart – Smart Queue Management Application</w:t>
+      </w:r>
+      <w:bookmarkEnd w:id="1"/>
+    </w:p>
+    <w:p>
+      <w:pPr>
+        <w:pStyle w:val="Heading2"/>
+        <w:keepNext w:val="0"/>
+        <w:keepLines w:val="0"/>
+        <w:spacing w:after="80"/>
         <w:rPr>
           <w:b/>
           <w:bCs/>
           <w:sz w:val="34"/>
           <w:szCs w:val="34"/>
         </w:rPr>
-        <w:t xml:space="preserve"> – Smart Queue Management Application</w:t>
-      </w:r>
-      <w:bookmarkEnd w:id="1"/>
-    </w:p>
+      </w:pPr>
+      <w:bookmarkStart w:id="2" w:name="_k30j8ll6szyj"/>
+      <w:r>
+        <w:rPr>
+          <w:b/>
+          <w:bCs/>
+          <w:sz w:val="34"/>
+          <w:szCs w:val="34"/>
+        </w:rPr>
+        <w:t>1. Initial Thoughts</w:t>
+      </w:r>
+      <w:bookmarkEnd w:id="2"/>
+    </w:p>
+    <w:p>
+      <w:pPr>
+        <w:ind w:firstLine="720"/>
+      </w:pPr>
+      <w:r>
+        <w:t>QueueSmart will be designed as a web application that aims to help organizations manage waiting queues more efficiently, while giving users clearer visibility about their position and expected wait</w:t>
+      </w:r>
+      <w:r>
+        <w:t>-</w:t>
+      </w:r>
+      <w:r>
+        <w:t>time.</w:t>
+      </w:r>
+    </w:p>
+    <w:p/>
+    <w:p>
+      <w:pPr>
+        <w:rPr>
+          <w:i/>
+          <w:iCs/>
+          <w:lang w:val="en-US"/>
+        </w:rPr>
+      </w:pPr>
+      <w:r>
+        <w:rPr>
+          <w:i/>
+          <w:iCs/>
+          <w:lang w:val="en-US"/>
+        </w:rPr>
+        <w:t>a.</w:t>
+      </w:r>
+      <w:r>
+        <w:rPr>
+          <w:i/>
+          <w:iCs/>
+          <w:lang w:val="en-US"/>
+        </w:rPr>
+        <w:t xml:space="preserve"> Who are the main users of the system?</w:t>
+      </w:r>
+    </w:p>
+    <w:p>
+      <w:pPr>
+        <w:ind w:firstLine="720"/>
+        <w:rPr>
+          <w:lang w:val="en-US"/>
+        </w:rPr>
+      </w:pPr>
+      <w:r>
+        <w:rPr>
+          <w:lang w:val="en-US"/>
+        </w:rPr>
+        <w:t xml:space="preserve">There will be two categories of users in QueueSmart, Users, and </w:t>
+      </w:r>
+      <w:r>
+        <w:rPr>
+          <w:lang w:val="en-US"/>
+        </w:rPr>
+        <w:t>Adminis</w:t>
+      </w:r>
+      <w:r>
+        <w:rPr>
+          <w:lang w:val="en-US"/>
+        </w:rPr>
+        <w:t>trators</w:t>
+      </w:r>
+      <w:r>
+        <w:rPr>
+          <w:lang w:val="en-US"/>
+        </w:rPr>
+        <w:t>. Possible users include students, customers, and</w:t>
+      </w:r>
+      <w:r>
+        <w:rPr>
+          <w:lang w:val="en-US"/>
+        </w:rPr>
+        <w:t xml:space="preserve"> patients who want to join a virtual queue or schedule a service without having to wait in a physical line. </w:t>
+      </w:r>
+      <w:r>
+        <w:rPr>
+          <w:lang w:val="en-US"/>
+        </w:rPr>
+        <w:t xml:space="preserve">Administrators will work with QueueSmart and Users/Customers to provide them with their service as seamlessly </w:t>
+      </w:r>
+      <w:r>
+        <w:rPr>
+          <w:lang w:val="en-US"/>
+        </w:rPr>
+        <w:t xml:space="preserve">and efficiently </w:t>
+      </w:r>
+      <w:r>
+        <w:rPr>
+          <w:lang w:val="en-US"/>
+        </w:rPr>
+        <w:t>as possible.</w:t>
+      </w:r>
+    </w:p>
+    <w:p>
+      <w:pPr>
+        <w:ind w:firstLine="720"/>
+        <w:rPr>
+          <w:lang w:val="en-US"/>
+        </w:rPr>
+      </w:pPr>
+    </w:p>
+    <w:p>
+      <w:pPr>
+        <w:rPr>
+          <w:i/>
+          <w:iCs/>
+          <w:lang w:val="en-US"/>
+        </w:rPr>
+      </w:pPr>
+      <w:r>
+        <w:rPr>
+          <w:i/>
+          <w:iCs/>
+          <w:lang w:val="en-US"/>
+        </w:rPr>
+        <w:t>b.</w:t>
+      </w:r>
+      <w:r>
+        <w:rPr>
+          <w:i/>
+          <w:iCs/>
+          <w:lang w:val="en-US"/>
+        </w:rPr>
+        <w:t xml:space="preserve"> How will users and administrators interact with the application?</w:t>
+      </w:r>
+    </w:p>
+    <w:p>
+      <w:pPr>
+        <w:ind w:firstLine="720"/>
+        <w:rPr>
+          <w:lang w:val="en-US"/>
+        </w:rPr>
+      </w:pPr>
+      <w:r>
+        <w:rPr>
+          <w:lang w:val="en-US"/>
+        </w:rPr>
+        <w:t>Both users and administrators will be able to register and login to the application. For users, logging in will allow them to browse and select a service to join a queue. They should be able to see their estimated wait</w:t>
+      </w:r>
+      <w:r>
+        <w:rPr>
+          <w:lang w:val="en-US"/>
+        </w:rPr>
+        <w:t>-</w:t>
+      </w:r>
+      <w:r>
+        <w:rPr>
+          <w:lang w:val="en-US"/>
+        </w:rPr>
+        <w:t>time,</w:t>
+      </w:r>
+      <w:r>
+        <w:rPr>
+          <w:lang w:val="en-US"/>
+        </w:rPr>
+        <w:t xml:space="preserve"> current position in the queue,</w:t>
+      </w:r>
+      <w:r>
+        <w:rPr>
+          <w:lang w:val="en-US"/>
+        </w:rPr>
+        <w:t xml:space="preserve"> leave the queue, </w:t>
+      </w:r>
+      <w:r>
+        <w:rPr>
+          <w:lang w:val="en-US"/>
+        </w:rPr>
+        <w:t xml:space="preserve">and receive notifications when their turn is approaching, as well as </w:t>
+      </w:r>
+      <w:r>
+        <w:rPr>
+          <w:lang w:val="en-US"/>
+        </w:rPr>
+        <w:t xml:space="preserve">once their wait is over. </w:t>
+      </w:r>
+      <w:r>
+        <w:rPr>
+          <w:lang w:val="en-US"/>
+        </w:rPr>
+        <w:t>Admins should</w:t>
+      </w:r>
+      <w:r>
+        <w:rPr>
+          <w:lang w:val="en-US"/>
+        </w:rPr>
+        <w:t xml:space="preserve"> be able to create</w:t>
+      </w:r>
+      <w:r>
+        <w:rPr>
+          <w:lang w:val="en-US"/>
+        </w:rPr>
+        <w:t xml:space="preserve">, </w:t>
+      </w:r>
+      <w:r>
+        <w:rPr>
+          <w:lang w:val="en-US"/>
+        </w:rPr>
+        <w:t>manage</w:t>
+      </w:r>
+      <w:r>
+        <w:rPr>
+          <w:lang w:val="en-US"/>
+        </w:rPr>
+        <w:t xml:space="preserve">, and update </w:t>
+      </w:r>
+      <w:r>
+        <w:rPr>
+          <w:lang w:val="en-US"/>
+        </w:rPr>
+        <w:t>services</w:t>
+      </w:r>
+      <w:r>
+        <w:rPr>
+          <w:lang w:val="en-US"/>
+        </w:rPr>
+        <w:t xml:space="preserve">, </w:t>
+      </w:r>
+      <w:r>
+        <w:rPr>
+          <w:lang w:val="en-US"/>
+        </w:rPr>
+        <w:t>give</w:t>
+      </w:r>
+      <w:r>
+        <w:rPr>
+          <w:lang w:val="en-US"/>
+        </w:rPr>
+        <w:t xml:space="preserve"> </w:t>
+      </w:r>
+      <w:r>
+        <w:rPr>
+          <w:lang w:val="en-US"/>
+        </w:rPr>
+        <w:t xml:space="preserve">services </w:t>
+      </w:r>
+      <w:r>
+        <w:rPr>
+          <w:lang w:val="en-US"/>
+        </w:rPr>
+        <w:t>a priority level, monitor active queues, serve or remove</w:t>
+      </w:r>
+      <w:r>
+        <w:rPr>
+          <w:lang w:val="en-US"/>
+        </w:rPr>
+        <w:t xml:space="preserve"> queue entries, and view basic usage </w:t>
+      </w:r>
+      <w:r>
+        <w:rPr>
+          <w:lang w:val="en-US"/>
+        </w:rPr>
+        <w:t>statistics and queue</w:t>
+      </w:r>
+      <w:r>
+        <w:rPr>
+          <w:lang w:val="en-US"/>
+        </w:rPr>
+        <w:t xml:space="preserve"> history, like queue length, number of users served, and average wait-time.</w:t>
+      </w:r>
+    </w:p>
+    <w:p>
+      <w:pPr>
+        <w:rPr>
+          <w:lang w:val="en-US"/>
+        </w:rPr>
+      </w:pPr>
+    </w:p>
+    <w:p>
+      <w:pPr>
+        <w:rPr>
+          <w:i/>
+          <w:iCs/>
+          <w:lang w:val="en-US"/>
+        </w:rPr>
+      </w:pPr>
+      <w:r>
+        <w:rPr>
+          <w:i/>
+          <w:iCs/>
+          <w:lang w:val="en-US"/>
+        </w:rPr>
+        <w:t>c</w:t>
+      </w:r>
+      <w:r>
+        <w:rPr>
+          <w:i/>
+          <w:iCs/>
+          <w:lang w:val="en-US"/>
+        </w:rPr>
+        <w:t>. What are the most important features?</w:t>
+      </w:r>
+    </w:p>
+    <w:p>
+      <w:pPr>
+        <w:ind w:firstLine="720"/>
+        <w:rPr>
+          <w:lang w:val="en-US"/>
+        </w:rPr>
+      </w:pPr>
+      <w:r>
+        <w:rPr>
+          <w:lang w:val="en-US"/>
+        </w:rPr>
+        <w:t>The most important feature</w:t>
+      </w:r>
+      <w:r>
+        <w:rPr>
+          <w:lang w:val="en-US"/>
+        </w:rPr>
+        <w:t>s</w:t>
+      </w:r>
+      <w:r>
+        <w:rPr>
+          <w:lang w:val="en-US"/>
+        </w:rPr>
+        <w:t xml:space="preserve"> for QueueSmart </w:t>
+      </w:r>
+      <w:r>
+        <w:rPr>
+          <w:lang w:val="en-US"/>
+        </w:rPr>
+        <w:t>are reliable queue management, clear wait-time information for their service, role-based access, service management, and notifications</w:t>
+      </w:r>
+      <w:r>
+        <w:rPr>
+          <w:lang w:val="en-US"/>
+        </w:rPr>
+        <w:t xml:space="preserve">. </w:t>
+      </w:r>
+      <w:r>
+        <w:rPr>
+          <w:lang w:val="en-US"/>
+        </w:rPr>
+        <w:t>The ordering of the queue will consider both the arrival time and priority of the service, where generally users who arrived earlier should be served earlier and higher priority services may move ahead if appropriate. The backend will use the expected service time and number of people ahead of the user to compute the estimated wait</w:t>
+      </w:r>
+      <w:r>
+        <w:rPr>
+          <w:lang w:val="en-US"/>
+        </w:rPr>
+        <w:t>-</w:t>
+      </w:r>
+      <w:r>
+        <w:rPr>
+          <w:lang w:val="en-US"/>
+        </w:rPr>
+        <w:t>time for the user.</w:t>
+      </w:r>
+    </w:p>
+    <w:p>
+      <w:pPr>
+        <w:rPr>
+          <w:i/>
+          <w:iCs/>
+          <w:lang w:val="en-US"/>
+        </w:rPr>
+      </w:pPr>
+    </w:p>
+    <w:p>
+      <w:pPr>
+        <w:rPr>
+          <w:i/>
+          <w:iCs/>
+          <w:lang w:val="en-US"/>
+        </w:rPr>
+      </w:pPr>
+      <w:r>
+        <w:rPr>
+          <w:i/>
+          <w:iCs/>
+          <w:lang w:val="en-US"/>
+        </w:rPr>
+        <w:t>d</w:t>
+      </w:r>
+      <w:r>
+        <w:rPr>
+          <w:i/>
+          <w:iCs/>
+          <w:lang w:val="en-US"/>
+        </w:rPr>
+        <w:t>. What challenges do you anticipate?</w:t>
+      </w:r>
+    </w:p>
+    <w:p>
+      <w:pPr>
+        <w:ind w:firstLine="720"/>
+        <w:rPr>
+          <w:lang w:val="en-US"/>
+        </w:rPr>
+      </w:pPr>
+      <w:r>
+        <w:rPr>
+          <w:lang w:val="en-US"/>
+        </w:rPr>
+        <w:t xml:space="preserve">Some challenges that </w:t>
+      </w:r>
+      <w:r>
+        <w:rPr>
+          <w:lang w:val="en-US"/>
+        </w:rPr>
+        <w:t>we e</w:t>
+      </w:r>
+      <w:r>
+        <w:rPr>
+          <w:lang w:val="en-US"/>
+        </w:rPr>
+        <w:t>xpect are being able to accurately determine wait</w:t>
+      </w:r>
+      <w:r>
+        <w:rPr>
+          <w:lang w:val="en-US"/>
+        </w:rPr>
+        <w:t>-</w:t>
+      </w:r>
+      <w:r>
+        <w:rPr>
+          <w:lang w:val="en-US"/>
+        </w:rPr>
+        <w:t>time</w:t>
+      </w:r>
+      <w:r>
+        <w:rPr>
+          <w:lang w:val="en-US"/>
+        </w:rPr>
+        <w:t xml:space="preserve">, as actual service times could vary. </w:t>
+      </w:r>
+      <w:r>
+        <w:rPr>
+          <w:lang w:val="en-US"/>
+        </w:rPr>
+        <w:t xml:space="preserve">The service may take longer depending on the time of day, the workers present, etc. </w:t>
+      </w:r>
+      <w:r>
+        <w:rPr>
+          <w:lang w:val="en-US"/>
+        </w:rPr>
+        <w:t>Additionally, queue information can change rapidly in cases where a user leaves the queue, admins change priorities, or a service takes longer than expected.</w:t>
+      </w:r>
+      <w:r>
+        <w:rPr>
+          <w:lang w:val="en-US"/>
+        </w:rPr>
+        <w:t xml:space="preserve"> </w:t>
+      </w:r>
+      <w:r>
+        <w:rPr>
+          <w:lang w:val="en-US"/>
+        </w:rPr>
+        <w:lastRenderedPageBreak/>
+        <w:t>N</w:t>
+      </w:r>
+      <w:r>
+        <w:rPr>
+          <w:lang w:val="en-US"/>
+        </w:rPr>
+        <w:t>otifications</w:t>
+      </w:r>
+      <w:r>
+        <w:rPr>
+          <w:lang w:val="en-US"/>
+        </w:rPr>
+        <w:t xml:space="preserve"> must be sent at the right times without sending any sort of duplicate or unnecessary information.</w:t>
+      </w:r>
+      <w:r>
+        <w:rPr>
+          <w:lang w:val="en-US"/>
+        </w:rPr>
+        <w:t xml:space="preserve"> </w:t>
+      </w:r>
+      <w:r>
+        <w:rPr>
+          <w:lang w:val="en-US"/>
+        </w:rPr>
+        <w:t>The system must also keep a fair queue while still supporting the higher priority levels.</w:t>
+      </w:r>
+      <w:r>
+        <w:rPr>
+          <w:lang w:val="en-US"/>
+        </w:rPr>
+        <w:t xml:space="preserve"> QueueSmart should also be designed with the issue of scalability in mind so that multiple active queues and users can be handled simultaneously without significantly reducing performance or reliability of the application. </w:t>
+      </w:r>
+      <w:r>
+        <w:rPr>
+          <w:lang w:val="en-US"/>
+        </w:rPr>
+        <w:t>The program crashing/being dysfunctional can cause major issues for companies using QueueSmart.</w:t>
+      </w:r>
+      <w:r>
+        <w:rPr>
+          <w:lang w:val="en-US"/>
+        </w:rPr>
+        <w:t xml:space="preserve"> Finally, authentication and authorization </w:t>
+      </w:r>
+      <w:r>
+        <w:rPr>
+          <w:lang w:val="en-US"/>
+        </w:rPr>
+        <w:t>must</w:t>
+      </w:r>
+      <w:r>
+        <w:rPr>
+          <w:lang w:val="en-US"/>
+        </w:rPr>
+        <w:t xml:space="preserve"> ensure that normal users cannot access features that are administrator only.</w:t>
+      </w:r>
+    </w:p>
+    <w:p/>
     <w:p>
       <w:pPr>
         <w:pStyle w:val="Heading2"/>
@@ -76,7 +599,7 @@
           <w:szCs w:val="34"/>
         </w:rPr>
       </w:pPr>
-      <w:bookmarkStart w:id="2" w:name="_k30j8ll6szyj"/>
+      <w:bookmarkStart w:id="3" w:name="_68llr56wlds4"/>
       <w:r>
         <w:rPr>
           <w:b/>
@@ -84,415 +607,38 @@
           <w:sz w:val="34"/>
           <w:szCs w:val="34"/>
         </w:rPr>
-        <w:t>1. Initial Thoughts</w:t>
-      </w:r>
-      <w:bookmarkEnd w:id="2"/>
-    </w:p>
-    <w:p>
-      <w:pPr>
-        <w:rPr>
-          <w:lang w:val="en-US"/>
-        </w:rPr>
-      </w:pPr>
-      <w:r>
-        <w:rPr>
-          <w:lang w:val="en-US"/>
-        </w:rPr>
-        <w:t>1. Who are the main users of the system?</w:t>
-      </w:r>
-    </w:p>
-    <w:p>
-      <w:pPr>
-        <w:rPr>
-          <w:lang w:val="en-US"/>
-        </w:rPr>
-      </w:pPr>
-    </w:p>
-    <w:p>
-      <w:pPr>
-        <w:rPr>
-          <w:lang w:val="en-US"/>
-        </w:rPr>
-      </w:pPr>
-      <w:r>
-        <w:rPr>
-          <w:lang w:val="en-US"/>
-        </w:rPr>
-        <w:t xml:space="preserve">There will be two categories of users in </w:t>
-      </w:r>
-      <w:proofErr w:type="spellStart"/>
-      <w:r>
-        <w:rPr>
-          <w:lang w:val="en-US"/>
-        </w:rPr>
-        <w:t>QueueSmart</w:t>
-      </w:r>
-      <w:proofErr w:type="spellEnd"/>
-      <w:r>
-        <w:rPr>
-          <w:lang w:val="en-US"/>
-        </w:rPr>
-        <w:t xml:space="preserve">, Users, and </w:t>
-      </w:r>
-      <w:proofErr w:type="spellStart"/>
-      <w:r>
-        <w:rPr>
-          <w:lang w:val="en-US"/>
-        </w:rPr>
-        <w:t>Administors</w:t>
-      </w:r>
-      <w:proofErr w:type="spellEnd"/>
-      <w:r>
-        <w:rPr>
-          <w:lang w:val="en-US"/>
-        </w:rPr>
-        <w:t xml:space="preserve">. Possible users include students, customers, and patients who need to schedule a service/appointment to avoid a physical line. Administrators will work with </w:t>
-      </w:r>
-      <w:proofErr w:type="spellStart"/>
-      <w:r>
-        <w:rPr>
-          <w:lang w:val="en-US"/>
-        </w:rPr>
-        <w:t>QueueSmart</w:t>
-      </w:r>
-      <w:proofErr w:type="spellEnd"/>
-      <w:r>
-        <w:rPr>
-          <w:lang w:val="en-US"/>
-        </w:rPr>
-        <w:t xml:space="preserve"> and Users/Customers to provide them with their service as seamlessly as possible.</w:t>
-      </w:r>
-    </w:p>
-    <w:p>
-      <w:pPr>
-        <w:rPr>
-          <w:lang w:val="en-US"/>
-        </w:rPr>
-      </w:pPr>
-    </w:p>
-    <w:p>
-      <w:pPr>
-        <w:rPr>
-          <w:lang w:val="en-US"/>
-        </w:rPr>
-      </w:pPr>
-      <w:r>
-        <w:rPr>
-          <w:lang w:val="en-US"/>
-        </w:rPr>
-        <w:t>2. How will users and administrators interact with the application?</w:t>
-      </w:r>
-    </w:p>
-    <w:p>
-      <w:pPr>
-        <w:rPr>
-          <w:lang w:val="en-US"/>
-        </w:rPr>
-      </w:pPr>
-    </w:p>
-    <w:p>
-      <w:pPr>
-        <w:rPr>
-          <w:lang w:val="en-US"/>
-        </w:rPr>
-      </w:pPr>
-      <w:r>
-        <w:rPr>
-          <w:lang w:val="en-US"/>
-        </w:rPr>
-        <w:t xml:space="preserve">Both users and administrators will be able to register and login to the application. For users, logging in will allow them to browse and select a service to join a queue. They should be able to see their estimated </w:t>
+        <w:t>2. Development Methodology</w:t>
+      </w:r>
+      <w:bookmarkEnd w:id="3"/>
+    </w:p>
+    <w:p>
+      <w:pPr>
+        <w:ind w:firstLine="720"/>
+      </w:pPr>
+      <w:r>
+        <w:t>For this project we will be using the S</w:t>
+      </w:r>
+      <w:r>
+        <w:t>crum</w:t>
+      </w:r>
+      <w:r>
+        <w:t xml:space="preserve"> development methodology. Scrum is an agile framework that divides the work into multiple sections called sprints. This allows us to build the project through iterative updates while giving us the flexibility of adjusting our design at any point during the process if changes are required. This is ideal for our project which is split into multiple assignments that require us to build our application piece by piece. Every work cycle will require us to evenly split the work amongst our group, execute our plan, receive feedback, and continuously improve our application. </w:t>
+      </w:r>
+    </w:p>
+    <w:p>
+      <w:pPr>
+        <w:ind w:firstLine="720"/>
+      </w:pPr>
+      <w:r>
+        <w:t xml:space="preserve">By using a shared repository on </w:t>
       </w:r>
       <w:proofErr w:type="gramStart"/>
       <w:r>
-        <w:rPr>
-          <w:lang w:val="en-US"/>
-        </w:rPr>
-        <w:t>wait</w:t>
+        <w:t>GitHub</w:t>
       </w:r>
       <w:proofErr w:type="gramEnd"/>
       <w:r>
-        <w:rPr>
-          <w:lang w:val="en-US"/>
-        </w:rPr>
-        <w:t xml:space="preserve"> time, leave the queue, and check in once an administrator is ready for them. Users should also receive a notification once their wait is over. For admins, they should be able to create and manage services, see who is in the queue in real time and manually adjust the queue and users as necessary. They should also be able to </w:t>
-      </w:r>
-      <w:proofErr w:type="gramStart"/>
-      <w:r>
-        <w:rPr>
-          <w:lang w:val="en-US"/>
-        </w:rPr>
-        <w:t>view user</w:t>
-      </w:r>
-      <w:proofErr w:type="gramEnd"/>
-      <w:r>
-        <w:rPr>
-          <w:lang w:val="en-US"/>
-        </w:rPr>
-        <w:t xml:space="preserve"> historical data that is relevant to their service.</w:t>
-      </w:r>
-    </w:p>
-    <w:p>
-      <w:pPr>
-        <w:rPr>
-          <w:lang w:val="en-US"/>
-        </w:rPr>
-      </w:pPr>
-    </w:p>
-    <w:p>
-      <w:pPr>
-        <w:rPr>
-          <w:lang w:val="en-US"/>
-        </w:rPr>
-      </w:pPr>
-      <w:r>
-        <w:rPr>
-          <w:lang w:val="en-US"/>
-        </w:rPr>
-        <w:t>3. What are the most important features?</w:t>
-      </w:r>
-    </w:p>
-    <w:p>
-      <w:pPr>
-        <w:rPr>
-          <w:lang w:val="en-US"/>
-        </w:rPr>
-      </w:pPr>
-    </w:p>
-    <w:p>
-      <w:pPr>
-        <w:rPr>
-          <w:lang w:val="en-US"/>
-        </w:rPr>
-      </w:pPr>
-      <w:r>
-        <w:rPr>
-          <w:lang w:val="en-US"/>
-        </w:rPr>
-        <w:t xml:space="preserve">The most important feature for </w:t>
-      </w:r>
-      <w:proofErr w:type="spellStart"/>
-      <w:r>
-        <w:rPr>
-          <w:lang w:val="en-US"/>
-        </w:rPr>
-        <w:t>QueueSmart</w:t>
-      </w:r>
-      <w:proofErr w:type="spellEnd"/>
-      <w:r>
-        <w:rPr>
-          <w:lang w:val="en-US"/>
-        </w:rPr>
-        <w:t xml:space="preserve"> is for users to be able to easily </w:t>
-      </w:r>
-      <w:proofErr w:type="gramStart"/>
-      <w:r>
-        <w:rPr>
-          <w:lang w:val="en-US"/>
-        </w:rPr>
-        <w:t>login</w:t>
-      </w:r>
-      <w:proofErr w:type="gramEnd"/>
-      <w:r>
-        <w:rPr>
-          <w:lang w:val="en-US"/>
-        </w:rPr>
-        <w:t xml:space="preserve">, choose a service and see their queue position and estimated wait time. Without these basic functions being easily accessible by a </w:t>
-      </w:r>
-      <w:proofErr w:type="gramStart"/>
-      <w:r>
-        <w:rPr>
-          <w:lang w:val="en-US"/>
-        </w:rPr>
-        <w:t>first time</w:t>
-      </w:r>
-      <w:proofErr w:type="gramEnd"/>
-      <w:r>
-        <w:rPr>
-          <w:lang w:val="en-US"/>
-        </w:rPr>
-        <w:t xml:space="preserve"> user, there is no point in using </w:t>
-      </w:r>
-      <w:proofErr w:type="spellStart"/>
-      <w:r>
-        <w:rPr>
-          <w:lang w:val="en-US"/>
-        </w:rPr>
-        <w:t>QueueSmart</w:t>
-      </w:r>
-      <w:proofErr w:type="spellEnd"/>
-      <w:r>
-        <w:rPr>
-          <w:lang w:val="en-US"/>
-        </w:rPr>
-        <w:t xml:space="preserve">. Notifications also need to be </w:t>
-      </w:r>
-      <w:proofErr w:type="gramStart"/>
-      <w:r>
-        <w:rPr>
-          <w:lang w:val="en-US"/>
-        </w:rPr>
-        <w:t>accurate,</w:t>
-      </w:r>
-      <w:proofErr w:type="gramEnd"/>
-      <w:r>
-        <w:rPr>
-          <w:lang w:val="en-US"/>
-        </w:rPr>
-        <w:t xml:space="preserve"> users should only receive </w:t>
-      </w:r>
-      <w:proofErr w:type="gramStart"/>
-      <w:r>
-        <w:rPr>
-          <w:lang w:val="en-US"/>
-        </w:rPr>
-        <w:t>a notification</w:t>
-      </w:r>
-      <w:proofErr w:type="gramEnd"/>
-      <w:r>
-        <w:rPr>
-          <w:lang w:val="en-US"/>
-        </w:rPr>
-        <w:t xml:space="preserve"> if admins are ready for a user to check in. On the admin side, they should be able to easily add services and have the right amount of configuration options.</w:t>
-      </w:r>
-    </w:p>
-    <w:p>
-      <w:pPr>
-        <w:rPr>
-          <w:lang w:val="en-US"/>
-        </w:rPr>
-      </w:pPr>
-    </w:p>
-    <w:p>
-      <w:pPr>
-        <w:rPr>
-          <w:lang w:val="en-US"/>
-        </w:rPr>
-      </w:pPr>
-      <w:r>
-        <w:rPr>
-          <w:lang w:val="en-US"/>
-        </w:rPr>
-        <w:t>4. What challenges do you anticipate?</w:t>
-      </w:r>
-    </w:p>
-    <w:p>
-      <w:pPr>
-        <w:rPr>
-          <w:lang w:val="en-US"/>
-        </w:rPr>
-      </w:pPr>
-      <w:r>
-        <w:rPr>
-          <w:lang w:val="en-US"/>
-        </w:rPr>
-        <w:t xml:space="preserve">Some challenges that I expect are being able to accurately determine wait time, reliability of notifications and management of customers not being present and cancelling. Service duration can vary a lot which can disrupt the accuracy of wait time. </w:t>
-      </w:r>
-      <w:proofErr w:type="gramStart"/>
-      <w:r>
-        <w:rPr>
-          <w:lang w:val="en-US"/>
-        </w:rPr>
-        <w:t>A service</w:t>
-      </w:r>
-      <w:proofErr w:type="gramEnd"/>
-      <w:r>
-        <w:rPr>
-          <w:lang w:val="en-US"/>
-        </w:rPr>
-        <w:t xml:space="preserve"> may take longer depending on the time of day, the workers present, etc. I also think the scalability of the program can be a major issue, </w:t>
-      </w:r>
-      <w:proofErr w:type="spellStart"/>
-      <w:r>
-        <w:rPr>
-          <w:lang w:val="en-US"/>
-        </w:rPr>
-        <w:t>QueueSmart</w:t>
-      </w:r>
-      <w:proofErr w:type="spellEnd"/>
-      <w:r>
-        <w:rPr>
-          <w:lang w:val="en-US"/>
-        </w:rPr>
-        <w:t xml:space="preserve"> needs to be able to handle a lot of simultaneous queues. The </w:t>
-      </w:r>
-      <w:r>
-        <w:rPr>
-          <w:lang w:val="en-US"/>
-        </w:rPr>
-        <w:lastRenderedPageBreak/>
-        <w:t xml:space="preserve">program crashing/being dysfunctional can cause major issues for companies using </w:t>
-      </w:r>
-      <w:proofErr w:type="spellStart"/>
-      <w:r>
-        <w:rPr>
-          <w:lang w:val="en-US"/>
-        </w:rPr>
-        <w:t>QueueSmart</w:t>
-      </w:r>
-      <w:proofErr w:type="spellEnd"/>
-      <w:r>
-        <w:rPr>
-          <w:lang w:val="en-US"/>
-        </w:rPr>
-        <w:t>.</w:t>
-      </w:r>
-    </w:p>
-    <w:p/>
-    <w:p>
-      <w:pPr>
-        <w:pStyle w:val="Heading2"/>
-        <w:keepNext w:val="0"/>
-        <w:keepLines w:val="0"/>
-        <w:spacing w:after="80"/>
-        <w:rPr>
-          <w:b/>
-          <w:bCs/>
-          <w:sz w:val="34"/>
-          <w:szCs w:val="34"/>
-        </w:rPr>
-      </w:pPr>
-      <w:bookmarkStart w:id="3" w:name="_68llr56wlds4"/>
-      <w:r>
-        <w:rPr>
-          <w:b/>
-          <w:bCs/>
-          <w:sz w:val="34"/>
-          <w:szCs w:val="34"/>
-        </w:rPr>
-        <w:t>2. Development Methodology</w:t>
-      </w:r>
-      <w:bookmarkEnd w:id="3"/>
-    </w:p>
-    <w:p>
-      <w:pPr>
-        <w:ind w:firstLine="720"/>
-      </w:pPr>
-      <w:r>
-        <w:t xml:space="preserve">For this project we will be using the SCRUM development methodology. Scrum is an agile framework that divides the work into multiple sections called sprints. This allows us to build the project through iterative updates while giving us the flexibility of adjusting our design at any point during the process if changes are required. This is ideal for our project which is split into multiple assignments that require us to build our application piece by piece. Every work cycle will require us to evenly split the work amongst our group, execute our plan, receive feedback, and continuously improve our application. </w:t>
-      </w:r>
-    </w:p>
-    <w:p>
-      <w:pPr>
-        <w:ind w:firstLine="720"/>
-      </w:pPr>
-      <w:r>
-        <w:t xml:space="preserve">By using a shared repository on </w:t>
-      </w:r>
-      <w:proofErr w:type="gramStart"/>
-      <w:r>
-        <w:t>GitHub</w:t>
-      </w:r>
-      <w:proofErr w:type="gramEnd"/>
-      <w:r>
-        <w:t xml:space="preserve"> we can coordinate our work efficiently and have a record of our individual contributions for each </w:t>
-      </w:r>
-      <w:proofErr w:type="gramStart"/>
-      <w:r>
-        <w:t>cycle of the project</w:t>
-      </w:r>
-      <w:proofErr w:type="gramEnd"/>
-      <w:r>
-        <w:t xml:space="preserve">. With everyone involved in every cycle, everyone becomes familiar with every section of the application which facilitates communication within our group. </w:t>
+        <w:t xml:space="preserve"> we can coordinate our work efficiently and have a record of our individual contributions for each cycle of the project. With everyone involved in every cycle, everyone becomes familiar with every section of the application which facilitates communication within our group. </w:t>
       </w:r>
     </w:p>
     <w:p>
@@ -547,7 +693,11 @@
       </w:r>
       <w:bookmarkEnd w:id="5"/>
     </w:p>
-    <w:p/>
+    <w:p>
+      <w:r>
+        <w:t>//diagram here</w:t>
+      </w:r>
+    </w:p>
     <w:p>
       <w:pPr>
         <w:pStyle w:val="Heading3"/>
@@ -682,25 +832,29 @@
         <w:ind w:firstLine="720"/>
       </w:pPr>
       <w:r>
-        <w:t xml:space="preserve">The Web Frontend provides interfaces to both the regular users and </w:t>
-      </w:r>
-      <w:proofErr w:type="gramStart"/>
-      <w:r>
-        <w:t>administrators use</w:t>
-      </w:r>
-      <w:proofErr w:type="gramEnd"/>
-      <w:r>
-        <w:t>. It displays queue position, estimated wait time, history, available services, and administrator management tools. The frontend sends user actions directly to the backend, without directly changing application data.</w:t>
+        <w:lastRenderedPageBreak/>
+        <w:t>The Web Frontend provides interfaces to both the regular users and administrators use. It displays queue position, estimated wait</w:t>
+      </w:r>
+      <w:r>
+        <w:t>-</w:t>
+      </w:r>
+      <w:r>
+        <w:t>time, history, available services, and administrator management tools. The frontend sends user actions directly to the backend, without directly changing application data.</w:t>
       </w:r>
     </w:p>
     <w:p>
       <w:r>
         <w:tab/>
-        <w:t xml:space="preserve">The Backend/API contains all main application logic. It authenticates users, manages services, processes join and leave requests, checks whether a user has the permissions of a </w:t>
-      </w:r>
-      <w:r>
-        <w:lastRenderedPageBreak/>
-        <w:t>regular user or an administrator, orders queue entries by arrival time and priority, computes estimated wait time of requests, prepares basic usage statistics, and records the queue history.</w:t>
+        <w:t>The Backend/API contains all main application logic. It authenticates users, manages services, processes join and leave requests, checks whether a user has the permissions of a regular user or an administrator, orders queue entries by arrival time and priority, computes estimated wait</w:t>
+      </w:r>
+      <w:r>
+        <w:t>-</w:t>
+      </w:r>
+      <w:r>
+        <w:t>times for users</w:t>
+      </w:r>
+      <w:r>
+        <w:t xml:space="preserve"> requests, prepares basic usage statistics, and records the queue history.</w:t>
       </w:r>
     </w:p>
     <w:p>
@@ -746,15 +900,7 @@
         <w:spacing w:before="240" w:after="240"/>
       </w:pPr>
       <w:r>
-        <w:t xml:space="preserve">A typical </w:t>
-      </w:r>
-      <w:proofErr w:type="spellStart"/>
-      <w:r>
-        <w:t>QueueSmart</w:t>
-      </w:r>
-      <w:proofErr w:type="spellEnd"/>
-      <w:r>
-        <w:t xml:space="preserve"> interaction works like this:</w:t>
+        <w:t>A typical QueueSmart interaction works like this:</w:t>
       </w:r>
     </w:p>
     <w:p>
@@ -767,15 +913,7 @@
         <w:spacing w:before="240" w:after="240"/>
       </w:pPr>
       <w:r>
-        <w:t xml:space="preserve">User or Administrator logs into the web application of </w:t>
-      </w:r>
-      <w:proofErr w:type="spellStart"/>
-      <w:r>
-        <w:t>QueueSmart</w:t>
-      </w:r>
-      <w:proofErr w:type="spellEnd"/>
-      <w:r>
-        <w:t>.</w:t>
+        <w:t>User or Administrator logs into the web application of QueueSmart.</w:t>
       </w:r>
     </w:p>
     <w:p>
@@ -814,7 +952,19 @@
         <w:spacing w:before="240" w:after="240"/>
       </w:pPr>
       <w:r>
-        <w:t>When user joins a queue, backend creates a queue array and stores it in the database.</w:t>
+        <w:t xml:space="preserve">When user joins a queue, backend creates a queue </w:t>
+      </w:r>
+      <w:r>
+        <w:t>entry for that user</w:t>
+      </w:r>
+      <w:r>
+        <w:t xml:space="preserve"> and stores </w:t>
+      </w:r>
+      <w:r>
+        <w:t xml:space="preserve">updates queue information </w:t>
+      </w:r>
+      <w:r>
+        <w:t>it in the database.</w:t>
       </w:r>
     </w:p>
     <w:p>
@@ -827,7 +977,13 @@
         <w:spacing w:before="240" w:after="240"/>
       </w:pPr>
       <w:r>
-        <w:t>Backend determines user’s position using arrival time and priority, and estimates wait time using expected duration of selected service.</w:t>
+        <w:t>Backend determines user’s position using arrival time and priority, and estimates wait</w:t>
+      </w:r>
+      <w:r>
+        <w:t>-</w:t>
+      </w:r>
+      <w:r>
+        <w:t>time using expected duration of selected service.</w:t>
       </w:r>
     </w:p>
     <w:p>
@@ -866,15 +1022,7 @@
         <w:spacing w:before="240" w:after="240"/>
       </w:pPr>
       <w:r>
-        <w:t xml:space="preserve">When service </w:t>
-      </w:r>
-      <w:proofErr w:type="gramStart"/>
-      <w:r>
-        <w:t>completed</w:t>
-      </w:r>
-      <w:proofErr w:type="gramEnd"/>
-      <w:r>
-        <w:t xml:space="preserve"> or user leaves queue, system updates active queue and saves the result in history.</w:t>
+        <w:t>When service completed or user leaves queue, system updates active queue and saves the result in history.</w:t>
       </w:r>
     </w:p>
     <w:p>
@@ -920,6 +1068,7 @@
           <w:sz w:val="34"/>
           <w:szCs w:val="34"/>
         </w:rPr>
+        <w:lastRenderedPageBreak/>
         <w:t>5. Team Contributions</w:t>
       </w:r>
       <w:bookmarkEnd w:id="10"/>
@@ -1059,7 +1208,148 @@
           </w:tcPr>
           <w:p>
             <w:r>
-              <w:lastRenderedPageBreak/>
+              <w:t>Tyler Landgrebe</w:t>
+            </w:r>
+          </w:p>
+        </w:tc>
+        <w:tc>
+          <w:tcPr>
+            <w:tcW w:w="5045" w:type="dxa"/>
+            <w:tcBorders>
+              <w:top w:val="nil"/>
+              <w:left w:val="nil"/>
+              <w:bottom w:val="nil"/>
+              <w:right w:val="nil"/>
+            </w:tcBorders>
+            <w:tcMar>
+              <w:top w:w="100" w:type="dxa"/>
+              <w:left w:w="100" w:type="dxa"/>
+              <w:bottom w:w="100" w:type="dxa"/>
+              <w:right w:w="100" w:type="dxa"/>
+            </w:tcMar>
+          </w:tcPr>
+          <w:p>
+            <w:r>
+              <w:t>Designed the optional Container Diagram, wrote the component interaction explanation, and integrated/proofread the final Markdown submission. Touched up and cleaned up document.</w:t>
+            </w:r>
+          </w:p>
+        </w:tc>
+        <w:tc>
+          <w:tcPr>
+            <w:tcW w:w="3055" w:type="dxa"/>
+            <w:tcBorders>
+              <w:top w:val="nil"/>
+              <w:left w:val="nil"/>
+              <w:bottom w:val="nil"/>
+              <w:right w:val="nil"/>
+            </w:tcBorders>
+            <w:tcMar>
+              <w:top w:w="100" w:type="dxa"/>
+              <w:left w:w="100" w:type="dxa"/>
+              <w:bottom w:w="100" w:type="dxa"/>
+              <w:right w:w="100" w:type="dxa"/>
+            </w:tcMar>
+          </w:tcPr>
+          <w:p>
+            <w:r>
+              <w:t>Focused on internal component responsibilities and consistency of the final document.</w:t>
+            </w:r>
+          </w:p>
+        </w:tc>
+      </w:tr>
+      <w:tr>
+        <w:trPr>
+          <w:trHeight w:val="1310"/>
+        </w:trPr>
+        <w:tc>
+          <w:tcPr>
+            <w:tcW w:w="1260" w:type="dxa"/>
+            <w:tcBorders>
+              <w:top w:val="nil"/>
+              <w:left w:val="nil"/>
+              <w:bottom w:val="nil"/>
+              <w:right w:val="nil"/>
+            </w:tcBorders>
+            <w:tcMar>
+              <w:top w:w="100" w:type="dxa"/>
+              <w:left w:w="100" w:type="dxa"/>
+              <w:bottom w:w="100" w:type="dxa"/>
+              <w:right w:w="100" w:type="dxa"/>
+            </w:tcMar>
+          </w:tcPr>
+          <w:p>
+            <w:r>
+              <w:t>Chase Beeler</w:t>
+            </w:r>
+          </w:p>
+        </w:tc>
+        <w:tc>
+          <w:tcPr>
+            <w:tcW w:w="5045" w:type="dxa"/>
+            <w:tcBorders>
+              <w:top w:val="nil"/>
+              <w:left w:val="nil"/>
+              <w:bottom w:val="nil"/>
+              <w:right w:val="nil"/>
+            </w:tcBorders>
+            <w:tcMar>
+              <w:top w:w="100" w:type="dxa"/>
+              <w:left w:w="100" w:type="dxa"/>
+              <w:bottom w:w="100" w:type="dxa"/>
+              <w:right w:w="100" w:type="dxa"/>
+            </w:tcMar>
+          </w:tcPr>
+          <w:p>
+            <w:r>
+              <w:t>Designed the System Context Diagram and wrote the System Context explanation, including the system boundary and external email service.</w:t>
+            </w:r>
+          </w:p>
+        </w:tc>
+        <w:tc>
+          <w:tcPr>
+            <w:tcW w:w="3055" w:type="dxa"/>
+            <w:tcBorders>
+              <w:top w:val="nil"/>
+              <w:left w:val="nil"/>
+              <w:bottom w:val="nil"/>
+              <w:right w:val="nil"/>
+            </w:tcBorders>
+            <w:tcMar>
+              <w:top w:w="100" w:type="dxa"/>
+              <w:left w:w="100" w:type="dxa"/>
+              <w:bottom w:w="100" w:type="dxa"/>
+              <w:right w:w="100" w:type="dxa"/>
+            </w:tcMar>
+          </w:tcPr>
+          <w:p>
+            <w:r>
+              <w:t>Focused on high-level architecture and external interactions.</w:t>
+            </w:r>
+          </w:p>
+        </w:tc>
+      </w:tr>
+      <w:tr>
+        <w:trPr>
+          <w:trHeight w:val="1310"/>
+        </w:trPr>
+        <w:tc>
+          <w:tcPr>
+            <w:tcW w:w="1260" w:type="dxa"/>
+            <w:tcBorders>
+              <w:top w:val="nil"/>
+              <w:left w:val="nil"/>
+              <w:bottom w:val="nil"/>
+              <w:right w:val="nil"/>
+            </w:tcBorders>
+            <w:tcMar>
+              <w:top w:w="100" w:type="dxa"/>
+              <w:left w:w="100" w:type="dxa"/>
+              <w:bottom w:w="100" w:type="dxa"/>
+              <w:right w:w="100" w:type="dxa"/>
+            </w:tcMar>
+          </w:tcPr>
+          <w:p>
+            <w:r>
               <w:t>Jeremy Yang</w:t>
             </w:r>
           </w:p>
@@ -1176,148 +1466,6 @@
           <w:p>
             <w:r>
               <w:t>Focused on how the team will organize work across A1–A4 and the final project.</w:t>
-            </w:r>
-          </w:p>
-        </w:tc>
-      </w:tr>
-      <w:tr>
-        <w:trPr>
-          <w:trHeight w:val="1040"/>
-        </w:trPr>
-        <w:tc>
-          <w:tcPr>
-            <w:tcW w:w="1260" w:type="dxa"/>
-            <w:tcBorders>
-              <w:top w:val="nil"/>
-              <w:left w:val="nil"/>
-              <w:bottom w:val="nil"/>
-              <w:right w:val="nil"/>
-            </w:tcBorders>
-            <w:tcMar>
-              <w:top w:w="100" w:type="dxa"/>
-              <w:left w:w="100" w:type="dxa"/>
-              <w:bottom w:w="100" w:type="dxa"/>
-              <w:right w:w="100" w:type="dxa"/>
-            </w:tcMar>
-          </w:tcPr>
-          <w:p>
-            <w:r>
-              <w:t>Chase Beeler</w:t>
-            </w:r>
-          </w:p>
-        </w:tc>
-        <w:tc>
-          <w:tcPr>
-            <w:tcW w:w="5045" w:type="dxa"/>
-            <w:tcBorders>
-              <w:top w:val="nil"/>
-              <w:left w:val="nil"/>
-              <w:bottom w:val="nil"/>
-              <w:right w:val="nil"/>
-            </w:tcBorders>
-            <w:tcMar>
-              <w:top w:w="100" w:type="dxa"/>
-              <w:left w:w="100" w:type="dxa"/>
-              <w:bottom w:w="100" w:type="dxa"/>
-              <w:right w:w="100" w:type="dxa"/>
-            </w:tcMar>
-          </w:tcPr>
-          <w:p>
-            <w:r>
-              <w:t>Designed the System Context Diagram and wrote the System Context explanation, including the system boundary and external email service.</w:t>
-            </w:r>
-          </w:p>
-        </w:tc>
-        <w:tc>
-          <w:tcPr>
-            <w:tcW w:w="3055" w:type="dxa"/>
-            <w:tcBorders>
-              <w:top w:val="nil"/>
-              <w:left w:val="nil"/>
-              <w:bottom w:val="nil"/>
-              <w:right w:val="nil"/>
-            </w:tcBorders>
-            <w:tcMar>
-              <w:top w:w="100" w:type="dxa"/>
-              <w:left w:w="100" w:type="dxa"/>
-              <w:bottom w:w="100" w:type="dxa"/>
-              <w:right w:w="100" w:type="dxa"/>
-            </w:tcMar>
-          </w:tcPr>
-          <w:p>
-            <w:r>
-              <w:t>Focused on high-level architecture and external interactions.</w:t>
-            </w:r>
-          </w:p>
-        </w:tc>
-      </w:tr>
-      <w:tr>
-        <w:trPr>
-          <w:trHeight w:val="1310"/>
-        </w:trPr>
-        <w:tc>
-          <w:tcPr>
-            <w:tcW w:w="1260" w:type="dxa"/>
-            <w:tcBorders>
-              <w:top w:val="nil"/>
-              <w:left w:val="nil"/>
-              <w:bottom w:val="nil"/>
-              <w:right w:val="nil"/>
-            </w:tcBorders>
-            <w:tcMar>
-              <w:top w:w="100" w:type="dxa"/>
-              <w:left w:w="100" w:type="dxa"/>
-              <w:bottom w:w="100" w:type="dxa"/>
-              <w:right w:w="100" w:type="dxa"/>
-            </w:tcMar>
-          </w:tcPr>
-          <w:p>
-            <w:r>
-              <w:t>Tyler Landgrebe</w:t>
-            </w:r>
-          </w:p>
-        </w:tc>
-        <w:tc>
-          <w:tcPr>
-            <w:tcW w:w="5045" w:type="dxa"/>
-            <w:tcBorders>
-              <w:top w:val="nil"/>
-              <w:left w:val="nil"/>
-              <w:bottom w:val="nil"/>
-              <w:right w:val="nil"/>
-            </w:tcBorders>
-            <w:tcMar>
-              <w:top w:w="100" w:type="dxa"/>
-              <w:left w:w="100" w:type="dxa"/>
-              <w:bottom w:w="100" w:type="dxa"/>
-              <w:right w:w="100" w:type="dxa"/>
-            </w:tcMar>
-          </w:tcPr>
-          <w:p>
-            <w:r>
-              <w:t>Designed the optional Container Diagram, wrote the component interaction explanation, and integrated/proofread the final Markdown submission.</w:t>
-            </w:r>
-          </w:p>
-        </w:tc>
-        <w:tc>
-          <w:tcPr>
-            <w:tcW w:w="3055" w:type="dxa"/>
-            <w:tcBorders>
-              <w:top w:val="nil"/>
-              <w:left w:val="nil"/>
-              <w:bottom w:val="nil"/>
-              <w:right w:val="nil"/>
-            </w:tcBorders>
-            <w:tcMar>
-              <w:top w:w="100" w:type="dxa"/>
-              <w:left w:w="100" w:type="dxa"/>
-              <w:bottom w:w="100" w:type="dxa"/>
-              <w:right w:w="100" w:type="dxa"/>
-            </w:tcMar>
-          </w:tcPr>
-          <w:p>
-            <w:r>
-              <w:t>Focused on internal component responsibilities and consistency of the final document.</w:t>
             </w:r>
           </w:p>
         </w:tc>
@@ -1944,6 +2092,7 @@
   <w:style w:type="character" w:default="1" w:styleId="DefaultParagraphFont">
     <w:name w:val="Default Paragraph Font"/>
     <w:uiPriority w:val="1"/>
+    <w:semiHidden/>
     <w:unhideWhenUsed/>
   </w:style>
   <w:style w:type="table" w:default="1" w:styleId="TableNormal">

</xml_diff>

<commit_message>
added pdf version for submission
</commit_message>
<xml_diff>
--- a/Assignment 1_ Initial Thoughts and System Design (A1).docx
+++ b/Assignment 1_ Initial Thoughts and System Design (A1).docx
@@ -1,6 +1,6 @@
 
 <file path=word/document.xml><?xml version="1.0" encoding="utf-8"?>
-<w:document xmlns:wpc="http://schemas.microsoft.com/office/word/2010/wordprocessingCanvas" xmlns:mc="http://schemas.openxmlformats.org/markup-compatibility/2006" xmlns:o="urn:schemas-microsoft-com:office:office" xmlns:r="http://schemas.openxmlformats.org/officeDocument/2006/relationships" xmlns:m="http://schemas.openxmlformats.org/officeDocument/2006/math" xmlns:v="urn:schemas-microsoft-com:vml" xmlns:wp14="http://schemas.microsoft.com/office/word/2010/wordprocessingDrawing" xmlns:wp="http://schemas.openxmlformats.org/drawingml/2006/wordprocessingDrawing" xmlns:w10="urn:schemas-microsoft-com:office:word" xmlns:w="http://schemas.openxmlformats.org/wordprocessingml/2006/main" xmlns:w14="http://schemas.microsoft.com/office/word/2010/wordml" xmlns:w15="http://schemas.microsoft.com/office/word/2012/wordml" xmlns:w16se="http://schemas.microsoft.com/office/word/2015/wordml/symex" xmlns:w16cid="http://schemas.microsoft.com/office/word/2016/wordml/cid" xmlns:w16="http://schemas.microsoft.com/office/word/2018/wordml" xmlns:w16cex="http://schemas.microsoft.com/office/word/2018/wordml/cex" xmlns:w16sdtdh="http://schemas.microsoft.com/office/word/2020/wordml/sdtdatahash" xmlns:wne="http://schemas.microsoft.com/office/word/2006/wordml" xmlns:wpg="http://schemas.microsoft.com/office/word/2010/wordprocessingGroup" xmlns:wps="http://schemas.microsoft.com/office/word/2010/wordprocessingShape" mc:Ignorable="w14 w15 w16se w16cid w16 w16cex w16sdtdh wp14">
+<w:document xmlns:wpc="http://schemas.microsoft.com/office/word/2010/wordprocessingCanvas" xmlns:cx="http://schemas.microsoft.com/office/drawing/2014/chartex" xmlns:cx1="http://schemas.microsoft.com/office/drawing/2015/9/8/chartex" xmlns:cx2="http://schemas.microsoft.com/office/drawing/2015/10/21/chartex" xmlns:cx3="http://schemas.microsoft.com/office/drawing/2016/5/9/chartex" xmlns:cx4="http://schemas.microsoft.com/office/drawing/2016/5/10/chartex" xmlns:cx5="http://schemas.microsoft.com/office/drawing/2016/5/11/chartex" xmlns:cx6="http://schemas.microsoft.com/office/drawing/2016/5/12/chartex" xmlns:cx7="http://schemas.microsoft.com/office/drawing/2016/5/13/chartex" xmlns:cx8="http://schemas.microsoft.com/office/drawing/2016/5/14/chartex" xmlns:mc="http://schemas.openxmlformats.org/markup-compatibility/2006" xmlns:aink="http://schemas.microsoft.com/office/drawing/2016/ink" xmlns:am3d="http://schemas.microsoft.com/office/drawing/2017/model3d" xmlns:o="urn:schemas-microsoft-com:office:office" xmlns:oel="http://schemas.microsoft.com/office/2019/extlst" xmlns:r="http://schemas.openxmlformats.org/officeDocument/2006/relationships" xmlns:m="http://schemas.openxmlformats.org/officeDocument/2006/math" xmlns:v="urn:schemas-microsoft-com:vml" xmlns:wp14="http://schemas.microsoft.com/office/word/2010/wordprocessingDrawing" xmlns:wp="http://schemas.openxmlformats.org/drawingml/2006/wordprocessingDrawing" xmlns:w10="urn:schemas-microsoft-com:office:word" xmlns:w="http://schemas.openxmlformats.org/wordprocessingml/2006/main" xmlns:w14="http://schemas.microsoft.com/office/word/2010/wordml" xmlns:w15="http://schemas.microsoft.com/office/word/2012/wordml" xmlns:w16cex="http://schemas.microsoft.com/office/word/2018/wordml/cex" xmlns:w16cid="http://schemas.microsoft.com/office/word/2016/wordml/cid" xmlns:w16="http://schemas.microsoft.com/office/word/2018/wordml" xmlns:w16du="http://schemas.microsoft.com/office/word/2023/wordml/word16du" xmlns:w16sdtdh="http://schemas.microsoft.com/office/word/2020/wordml/sdtdatahash" xmlns:w16sdtfl="http://schemas.microsoft.com/office/word/2024/wordml/sdtformatlock" xmlns:w16se="http://schemas.microsoft.com/office/word/2015/wordml/symex" xmlns:wpg="http://schemas.microsoft.com/office/word/2010/wordprocessingGroup" xmlns:wpi="http://schemas.microsoft.com/office/word/2010/wordprocessingInk" xmlns:wne="http://schemas.microsoft.com/office/word/2006/wordml" xmlns:wps="http://schemas.microsoft.com/office/word/2010/wordprocessingShape" mc:Ignorable="w14 w15 w16se w16cid w16 w16cex w16sdtdh w16sdtfl w16du wp14">
   <w:body>
     <w:p>
       <w:pPr>
@@ -18,7 +18,6 @@
       <w:bookmarkStart w:id="0" w:name="_w4ex58b5ecvo"/>
       <w:r>
         <w:rPr>
-          <w:rFonts w:ascii="Arial" w:hAnsi="Arial" w:eastAsia="Arial" w:cs="Arial"/>
           <w:b/>
           <w:bCs/>
           <w:sz w:val="46"/>
@@ -44,7 +43,6 @@
       <w:bookmarkStart w:id="1" w:name="_o2lkjt5mhw88"/>
       <w:r>
         <w:rPr>
-          <w:rFonts w:ascii="Arial" w:hAnsi="Arial" w:eastAsia="Arial" w:cs="Arial"/>
           <w:b/>
           <w:bCs/>
           <w:sz w:val="34"/>
@@ -70,7 +68,6 @@
       <w:bookmarkStart w:id="2" w:name="_k30j8ll6szyj"/>
       <w:r>
         <w:rPr>
-          <w:rFonts w:ascii="Arial" w:hAnsi="Arial" w:eastAsia="Arial" w:cs="Arial"/>
           <w:b/>
           <w:bCs/>
           <w:sz w:val="34"/>
@@ -85,35 +82,10 @@
         <w:ind w:firstLine="720"/>
       </w:pPr>
       <w:r>
-        <w:rPr>
-          <w:rFonts w:ascii="Arial" w:hAnsi="Arial" w:eastAsia="Arial" w:cs="Arial"/>
-          <w:sz w:val="22"/>
-          <w:szCs w:val="22"/>
-        </w:rPr>
-        <w:t>QueueSmart will be designed as a web application that aims to help organizations manage waiting queues more efficiently, while giving users clearer visibility about their position and expected wait</w:t>
-      </w:r>
-      <w:r>
-        <w:rPr>
-          <w:rFonts w:ascii="Arial" w:hAnsi="Arial" w:eastAsia="Arial" w:cs="Arial"/>
-          <w:sz w:val="22"/>
-          <w:szCs w:val="22"/>
-        </w:rPr>
-        <w:t>-</w:t>
-      </w:r>
-      <w:r>
-        <w:rPr>
-          <w:rFonts w:ascii="Arial" w:hAnsi="Arial" w:eastAsia="Arial" w:cs="Arial"/>
-          <w:sz w:val="22"/>
-          <w:szCs w:val="22"/>
-        </w:rPr>
-        <w:t>time.</w:t>
-      </w:r>
-    </w:p>
-    <w:p>
-      <w:pPr>
-        <w:spacing w:line="276" w:lineRule="auto"/>
-      </w:pPr>
-    </w:p>
+        <w:t>QueueSmart will be designed as a web application that aims to help organizations manage waiting queues more efficiently, while giving users clearer visibility about their position and expected wait-time.</w:t>
+      </w:r>
+    </w:p>
+    <w:p/>
     <w:p>
       <w:pPr>
         <w:rPr>
@@ -123,125 +95,62 @@
       </w:pPr>
       <w:r>
         <w:rPr>
-          <w:rFonts w:ascii="Arial" w:hAnsi="Arial" w:eastAsia="Arial" w:cs="Arial"/>
           <w:i/>
           <w:iCs/>
-          <w:sz w:val="22"/>
-          <w:szCs w:val="22"/>
-        </w:rPr>
-        <w:t>a.</w:t>
-      </w:r>
-      <w:r>
-        <w:rPr>
-          <w:rFonts w:ascii="Arial" w:hAnsi="Arial" w:eastAsia="Arial" w:cs="Arial"/>
+        </w:rPr>
+        <w:t>a. Who are the main users of the system?</w:t>
+      </w:r>
+    </w:p>
+    <w:p>
+      <w:pPr>
+        <w:ind w:firstLine="720"/>
+      </w:pPr>
+      <w:r>
+        <w:t>There will be two categories of users in QueueSmart, Users, and Administrators. Possible users include students, customers, and patients who want to join a virtual queue or schedule a service without having to wait in a physical line. Administrators will work with QueueSmart and Users/Customers to provide them with their service as seamlessly and efficiently as possible.</w:t>
+      </w:r>
+    </w:p>
+    <w:p>
+      <w:pPr>
+        <w:ind w:firstLine="720"/>
+      </w:pPr>
+    </w:p>
+    <w:p>
+      <w:pPr>
+        <w:rPr>
           <w:i/>
           <w:iCs/>
-          <w:sz w:val="22"/>
-          <w:szCs w:val="22"/>
-        </w:rPr>
-        <w:t xml:space="preserve"> Who are the main users of the system?</w:t>
-      </w:r>
-    </w:p>
-    <w:p>
-      <w:pPr>
-        <w:ind w:firstLine="720"/>
-      </w:pPr>
-      <w:r>
-        <w:rPr>
-          <w:rFonts w:ascii="Arial" w:hAnsi="Arial" w:eastAsia="Arial" w:cs="Arial"/>
-          <w:sz w:val="22"/>
-          <w:szCs w:val="22"/>
-        </w:rPr>
-        <w:t xml:space="preserve">There will be two categories of users in QueueSmart, Users, and </w:t>
-      </w:r>
-      <w:r>
-        <w:rPr>
-          <w:rFonts w:ascii="Arial" w:hAnsi="Arial" w:eastAsia="Arial" w:cs="Arial"/>
-          <w:sz w:val="22"/>
-          <w:szCs w:val="22"/>
-        </w:rPr>
-        <w:t>Adminis</w:t>
-      </w:r>
-      <w:r>
-        <w:rPr>
-          <w:rFonts w:ascii="Arial" w:hAnsi="Arial" w:eastAsia="Arial" w:cs="Arial"/>
-          <w:sz w:val="22"/>
-          <w:szCs w:val="22"/>
-        </w:rPr>
-        <w:t>trators</w:t>
-      </w:r>
-      <w:r>
-        <w:rPr>
-          <w:rFonts w:ascii="Arial" w:hAnsi="Arial" w:eastAsia="Arial" w:cs="Arial"/>
-          <w:sz w:val="22"/>
-          <w:szCs w:val="22"/>
-        </w:rPr>
-        <w:t>. Possible users include students, customers, and</w:t>
-      </w:r>
-      <w:r>
-        <w:rPr>
-          <w:rFonts w:ascii="Arial" w:hAnsi="Arial" w:eastAsia="Arial" w:cs="Arial"/>
-          <w:sz w:val="22"/>
-          <w:szCs w:val="22"/>
-        </w:rPr>
-        <w:t xml:space="preserve"> patients who want to join a virtual queue or schedule a service without having to wait in a physical line. </w:t>
-      </w:r>
-      <w:r>
-        <w:rPr>
-          <w:rFonts w:ascii="Arial" w:hAnsi="Arial" w:eastAsia="Arial" w:cs="Arial"/>
-          <w:sz w:val="22"/>
-          <w:szCs w:val="22"/>
-        </w:rPr>
-        <w:t xml:space="preserve">Administrators will work with QueueSmart and Users/Customers to provide them with their service as seamlessly </w:t>
-      </w:r>
-      <w:r>
-        <w:rPr>
-          <w:rFonts w:ascii="Arial" w:hAnsi="Arial" w:eastAsia="Arial" w:cs="Arial"/>
-          <w:sz w:val="22"/>
-          <w:szCs w:val="22"/>
-        </w:rPr>
-        <w:t xml:space="preserve">and efficiently </w:t>
-      </w:r>
-      <w:r>
-        <w:rPr>
-          <w:rFonts w:ascii="Arial" w:hAnsi="Arial" w:eastAsia="Arial" w:cs="Arial"/>
-          <w:sz w:val="22"/>
-          <w:szCs w:val="22"/>
-        </w:rPr>
-        <w:t>as possible.</w:t>
-      </w:r>
-    </w:p>
-    <w:p>
-      <w:pPr>
-        <w:ind w:firstLine="720"/>
-      </w:pPr>
-    </w:p>
-    <w:p>
-      <w:pPr>
+        </w:rPr>
+      </w:pPr>
+      <w:r>
         <w:rPr>
           <w:i/>
           <w:iCs/>
         </w:rPr>
-      </w:pPr>
-      <w:r>
-        <w:rPr>
-          <w:rFonts w:ascii="Arial" w:hAnsi="Arial" w:eastAsia="Arial" w:cs="Arial"/>
+        <w:t>b. How will users and administrators interact with the application?</w:t>
+      </w:r>
+    </w:p>
+    <w:p>
+      <w:pPr>
+        <w:ind w:firstLine="720"/>
+      </w:pPr>
+      <w:r>
+        <w:t>Both users and administrators will be able to register and login to the application. For users, logging in will allow them to browse and select a service to join a queue. They should be able to see their estimated wait-time, current position in the queue, leave the queue, and receive notifications when their turn is approaching, as well as once their wait is over. Admins should be able to create, manage, and update services, give services a priority level, monitor active queues, serve or remove queue entries, and view basic usage statistics and queue history, like queue length, number of users served, and average wait-time.</w:t>
+      </w:r>
+    </w:p>
+    <w:p/>
+    <w:p>
+      <w:pPr>
+        <w:rPr>
           <w:i/>
           <w:iCs/>
-          <w:sz w:val="22"/>
-          <w:szCs w:val="22"/>
-        </w:rPr>
-        <w:t>b.</w:t>
-      </w:r>
-      <w:r>
-        <w:rPr>
-          <w:rFonts w:ascii="Arial" w:hAnsi="Arial" w:eastAsia="Arial" w:cs="Arial"/>
+        </w:rPr>
+      </w:pPr>
+      <w:r>
+        <w:rPr>
           <w:i/>
           <w:iCs/>
-          <w:sz w:val="22"/>
-          <w:szCs w:val="22"/>
-        </w:rPr>
-        <w:t xml:space="preserve"> How will users and administrators interact with the application?</w:t>
+        </w:rPr>
+        <w:t>c. What are the most important features?</w:t>
       </w:r>
     </w:p>
     <w:p>
@@ -249,175 +158,9 @@
         <w:ind w:firstLine="720"/>
       </w:pPr>
       <w:r>
-        <w:rPr>
-          <w:rFonts w:ascii="Arial" w:hAnsi="Arial" w:eastAsia="Arial" w:cs="Arial"/>
-          <w:sz w:val="22"/>
-          <w:szCs w:val="22"/>
-        </w:rPr>
-        <w:t>Both users and administrators will be able to register and login to the application. For users, logging in will allow them to browse and select a service to join a queue. They should be able to see their estimated wait</w:t>
-      </w:r>
-      <w:r>
-        <w:rPr>
-          <w:rFonts w:ascii="Arial" w:hAnsi="Arial" w:eastAsia="Arial" w:cs="Arial"/>
-          <w:sz w:val="22"/>
-          <w:szCs w:val="22"/>
-        </w:rPr>
-        <w:t>-</w:t>
-      </w:r>
-      <w:r>
-        <w:rPr>
-          <w:rFonts w:ascii="Arial" w:hAnsi="Arial" w:eastAsia="Arial" w:cs="Arial"/>
-          <w:sz w:val="22"/>
-          <w:szCs w:val="22"/>
-        </w:rPr>
-        <w:t>time,</w:t>
-      </w:r>
-      <w:r>
-        <w:rPr>
-          <w:rFonts w:ascii="Arial" w:hAnsi="Arial" w:eastAsia="Arial" w:cs="Arial"/>
-          <w:sz w:val="22"/>
-          <w:szCs w:val="22"/>
-        </w:rPr>
-        <w:t xml:space="preserve"> current position in the queue,</w:t>
-      </w:r>
-      <w:r>
-        <w:rPr>
-          <w:rFonts w:ascii="Arial" w:hAnsi="Arial" w:eastAsia="Arial" w:cs="Arial"/>
-          <w:sz w:val="22"/>
-          <w:szCs w:val="22"/>
-        </w:rPr>
-        <w:t xml:space="preserve"> leave the queue, </w:t>
-      </w:r>
-      <w:r>
-        <w:rPr>
-          <w:rFonts w:ascii="Arial" w:hAnsi="Arial" w:eastAsia="Arial" w:cs="Arial"/>
-          <w:sz w:val="22"/>
-          <w:szCs w:val="22"/>
-        </w:rPr>
-        <w:t xml:space="preserve">and receive notifications when their turn is approaching, as well as </w:t>
-      </w:r>
-      <w:r>
-        <w:rPr>
-          <w:rFonts w:ascii="Arial" w:hAnsi="Arial" w:eastAsia="Arial" w:cs="Arial"/>
-          <w:sz w:val="22"/>
-          <w:szCs w:val="22"/>
-        </w:rPr>
-        <w:t xml:space="preserve">once their wait is over. </w:t>
-      </w:r>
-      <w:r>
-        <w:rPr>
-          <w:rFonts w:ascii="Arial" w:hAnsi="Arial" w:eastAsia="Arial" w:cs="Arial"/>
-          <w:sz w:val="22"/>
-          <w:szCs w:val="22"/>
-        </w:rPr>
-        <w:t>Admins should</w:t>
-      </w:r>
-      <w:r>
-        <w:rPr>
-          <w:rFonts w:ascii="Arial" w:hAnsi="Arial" w:eastAsia="Arial" w:cs="Arial"/>
-          <w:sz w:val="22"/>
-          <w:szCs w:val="22"/>
-        </w:rPr>
-        <w:t xml:space="preserve"> be able to create</w:t>
-      </w:r>
-      <w:r>
-        <w:rPr>
-          <w:rFonts w:ascii="Arial" w:hAnsi="Arial" w:eastAsia="Arial" w:cs="Arial"/>
-          <w:sz w:val="22"/>
-          <w:szCs w:val="22"/>
-        </w:rPr>
-        <w:t xml:space="preserve">, </w:t>
-      </w:r>
-      <w:r>
-        <w:rPr>
-          <w:rFonts w:ascii="Arial" w:hAnsi="Arial" w:eastAsia="Arial" w:cs="Arial"/>
-          <w:sz w:val="22"/>
-          <w:szCs w:val="22"/>
-        </w:rPr>
-        <w:t>manage</w:t>
-      </w:r>
-      <w:r>
-        <w:rPr>
-          <w:rFonts w:ascii="Arial" w:hAnsi="Arial" w:eastAsia="Arial" w:cs="Arial"/>
-          <w:sz w:val="22"/>
-          <w:szCs w:val="22"/>
-        </w:rPr>
-        <w:t xml:space="preserve">, and update </w:t>
-      </w:r>
-      <w:r>
-        <w:rPr>
-          <w:rFonts w:ascii="Arial" w:hAnsi="Arial" w:eastAsia="Arial" w:cs="Arial"/>
-          <w:sz w:val="22"/>
-          <w:szCs w:val="22"/>
-        </w:rPr>
-        <w:t>services</w:t>
-      </w:r>
-      <w:r>
-        <w:rPr>
-          <w:rFonts w:ascii="Arial" w:hAnsi="Arial" w:eastAsia="Arial" w:cs="Arial"/>
-          <w:sz w:val="22"/>
-          <w:szCs w:val="22"/>
-        </w:rPr>
-        <w:t xml:space="preserve">, </w:t>
-      </w:r>
-      <w:r>
-        <w:rPr>
-          <w:rFonts w:ascii="Arial" w:hAnsi="Arial" w:eastAsia="Arial" w:cs="Arial"/>
-          <w:sz w:val="22"/>
-          <w:szCs w:val="22"/>
-        </w:rPr>
-        <w:t>give</w:t>
-      </w:r>
-      <w:r>
-        <w:rPr>
-          <w:rFonts w:ascii="Arial" w:hAnsi="Arial" w:eastAsia="Arial" w:cs="Arial"/>
-          <w:sz w:val="22"/>
-          <w:szCs w:val="22"/>
-        </w:rPr>
-        <w:t xml:space="preserve"> </w:t>
-      </w:r>
-      <w:r>
-        <w:rPr>
-          <w:rFonts w:ascii="Arial" w:hAnsi="Arial" w:eastAsia="Arial" w:cs="Arial"/>
-          <w:sz w:val="22"/>
-          <w:szCs w:val="22"/>
-        </w:rPr>
-        <w:t xml:space="preserve">services </w:t>
-      </w:r>
-      <w:r>
-        <w:rPr>
-          <w:rFonts w:ascii="Arial" w:hAnsi="Arial" w:eastAsia="Arial" w:cs="Arial"/>
-          <w:sz w:val="22"/>
-          <w:szCs w:val="22"/>
-        </w:rPr>
-        <w:t>a priority level, monitor active queues, serve or remove</w:t>
-      </w:r>
-      <w:r>
-        <w:rPr>
-          <w:rFonts w:ascii="Arial" w:hAnsi="Arial" w:eastAsia="Arial" w:cs="Arial"/>
-          <w:sz w:val="22"/>
-          <w:szCs w:val="22"/>
-        </w:rPr>
-        <w:t xml:space="preserve"> queue entries, and view basic usage </w:t>
-      </w:r>
-      <w:r>
-        <w:rPr>
-          <w:rFonts w:ascii="Arial" w:hAnsi="Arial" w:eastAsia="Arial" w:cs="Arial"/>
-          <w:sz w:val="22"/>
-          <w:szCs w:val="22"/>
-        </w:rPr>
-        <w:t>statistics and queue</w:t>
-      </w:r>
-      <w:r>
-        <w:rPr>
-          <w:rFonts w:ascii="Arial" w:hAnsi="Arial" w:eastAsia="Arial" w:cs="Arial"/>
-          <w:sz w:val="22"/>
-          <w:szCs w:val="22"/>
-        </w:rPr>
-        <w:t xml:space="preserve"> history, like queue length, number of users served, and average wait-time.</w:t>
-      </w:r>
-    </w:p>
-    <w:p/>
+        <w:t>The most important features for QueueSmart are reliable queue management, clear wait-time information for their service, role-based access, service management, and notifications. The ordering of the queue will consider both the arrival time and priority of the service, where generally users who arrived earlier should be served earlier and higher priority services may move ahead if appropriate. The backend will use the expected service time and number of people ahead of the user to compute the estimated wait-time for the user.</w:t>
+      </w:r>
+    </w:p>
     <w:p>
       <w:pPr>
         <w:rPr>
@@ -425,25 +168,20 @@
           <w:iCs/>
         </w:rPr>
       </w:pPr>
-      <w:r>
-        <w:rPr>
-          <w:rFonts w:ascii="Arial" w:hAnsi="Arial" w:eastAsia="Arial" w:cs="Arial"/>
+    </w:p>
+    <w:p>
+      <w:pPr>
+        <w:rPr>
           <w:i/>
           <w:iCs/>
-          <w:sz w:val="22"/>
-          <w:szCs w:val="22"/>
-        </w:rPr>
-        <w:t>c</w:t>
-      </w:r>
-      <w:r>
-        <w:rPr>
-          <w:rFonts w:ascii="Arial" w:hAnsi="Arial" w:eastAsia="Arial" w:cs="Arial"/>
+        </w:rPr>
+      </w:pPr>
+      <w:r>
+        <w:rPr>
           <w:i/>
           <w:iCs/>
-          <w:sz w:val="22"/>
-          <w:szCs w:val="22"/>
-        </w:rPr>
-        <w:t>. What are the most important features?</w:t>
+        </w:rPr>
+        <w:t>d. What challenges do you anticipate?</w:t>
       </w:r>
     </w:p>
     <w:p>
@@ -451,268 +189,14 @@
         <w:ind w:firstLine="720"/>
       </w:pPr>
       <w:r>
-        <w:rPr>
-          <w:rFonts w:ascii="Arial" w:hAnsi="Arial" w:eastAsia="Arial" w:cs="Arial"/>
-          <w:sz w:val="22"/>
-          <w:szCs w:val="22"/>
-        </w:rPr>
-        <w:t>The most important feature</w:t>
-      </w:r>
-      <w:r>
-        <w:rPr>
-          <w:rFonts w:ascii="Arial" w:hAnsi="Arial" w:eastAsia="Arial" w:cs="Arial"/>
-          <w:sz w:val="22"/>
-          <w:szCs w:val="22"/>
-        </w:rPr>
-        <w:t>s</w:t>
-      </w:r>
-      <w:r>
-        <w:rPr>
-          <w:rFonts w:ascii="Arial" w:hAnsi="Arial" w:eastAsia="Arial" w:cs="Arial"/>
-          <w:sz w:val="22"/>
-          <w:szCs w:val="22"/>
-        </w:rPr>
-        <w:t xml:space="preserve"> for QueueSmart </w:t>
-      </w:r>
-      <w:r>
-        <w:rPr>
-          <w:rFonts w:ascii="Arial" w:hAnsi="Arial" w:eastAsia="Arial" w:cs="Arial"/>
-          <w:sz w:val="22"/>
-          <w:szCs w:val="22"/>
-        </w:rPr>
-        <w:t>are reliable queue management, clear wait-time information for their service, role-based access, service management, and notifications</w:t>
-      </w:r>
-      <w:r>
-        <w:rPr>
-          <w:rFonts w:ascii="Arial" w:hAnsi="Arial" w:eastAsia="Arial" w:cs="Arial"/>
-          <w:sz w:val="22"/>
-          <w:szCs w:val="22"/>
-        </w:rPr>
-        <w:t xml:space="preserve">. </w:t>
-      </w:r>
-      <w:r>
-        <w:rPr>
-          <w:rFonts w:ascii="Arial" w:hAnsi="Arial" w:eastAsia="Arial" w:cs="Arial"/>
-          <w:sz w:val="22"/>
-          <w:szCs w:val="22"/>
-        </w:rPr>
-        <w:t>The ordering of the queue will consider both the arrival time and priority of the service, where generally users who arrived earlier should be served earlier and higher priority services may move ahead if appropriate. The backend will use the expected service time and number of people ahead of the user to compute the estimated wait</w:t>
-      </w:r>
-      <w:r>
-        <w:rPr>
-          <w:rFonts w:ascii="Arial" w:hAnsi="Arial" w:eastAsia="Arial" w:cs="Arial"/>
-          <w:sz w:val="22"/>
-          <w:szCs w:val="22"/>
-        </w:rPr>
-        <w:t>-</w:t>
-      </w:r>
-      <w:r>
-        <w:rPr>
-          <w:rFonts w:ascii="Arial" w:hAnsi="Arial" w:eastAsia="Arial" w:cs="Arial"/>
-          <w:sz w:val="22"/>
-          <w:szCs w:val="22"/>
-        </w:rPr>
-        <w:t>time for the user.</w:t>
-      </w:r>
-    </w:p>
-    <w:p>
-      <w:pPr>
-        <w:rPr>
-          <w:i/>
-          <w:iCs/>
-        </w:rPr>
-      </w:pPr>
-    </w:p>
-    <w:p>
-      <w:pPr>
-        <w:rPr>
-          <w:i/>
-          <w:iCs/>
-        </w:rPr>
-      </w:pPr>
-      <w:r>
-        <w:rPr>
-          <w:rFonts w:ascii="Arial" w:hAnsi="Arial" w:eastAsia="Arial" w:cs="Arial"/>
-          <w:i/>
-          <w:iCs/>
-          <w:sz w:val="22"/>
-          <w:szCs w:val="22"/>
-        </w:rPr>
-        <w:t>d</w:t>
-      </w:r>
-      <w:r>
-        <w:rPr>
-          <w:rFonts w:ascii="Arial" w:hAnsi="Arial" w:eastAsia="Arial" w:cs="Arial"/>
-          <w:i/>
-          <w:iCs/>
-          <w:sz w:val="22"/>
-          <w:szCs w:val="22"/>
-        </w:rPr>
-        <w:t>. What challenges do you anticipate?</w:t>
-      </w:r>
-    </w:p>
-    <w:p>
-      <w:pPr>
-        <w:ind w:firstLine="720"/>
-      </w:pPr>
-      <w:r>
-        <w:rPr>
-          <w:rFonts w:ascii="Arial" w:hAnsi="Arial" w:eastAsia="Arial" w:cs="Arial"/>
-          <w:sz w:val="22"/>
-          <w:szCs w:val="22"/>
-        </w:rPr>
-        <w:t xml:space="preserve">Some challenges that </w:t>
-      </w:r>
-      <w:r>
-        <w:rPr>
-          <w:rFonts w:ascii="Arial" w:hAnsi="Arial" w:eastAsia="Arial" w:cs="Arial"/>
-          <w:sz w:val="22"/>
-          <w:szCs w:val="22"/>
-        </w:rPr>
-        <w:t>we e</w:t>
-      </w:r>
-      <w:r>
-        <w:rPr>
-          <w:rFonts w:ascii="Arial" w:hAnsi="Arial" w:eastAsia="Arial" w:cs="Arial"/>
-          <w:sz w:val="22"/>
-          <w:szCs w:val="22"/>
-        </w:rPr>
-        <w:t>xpect are being able to accurately determine wait</w:t>
-      </w:r>
-      <w:r>
-        <w:rPr>
-          <w:rFonts w:ascii="Arial" w:hAnsi="Arial" w:eastAsia="Arial" w:cs="Arial"/>
-          <w:sz w:val="22"/>
-          <w:szCs w:val="22"/>
-        </w:rPr>
-        <w:t>-</w:t>
-      </w:r>
-      <w:r>
-        <w:rPr>
-          <w:rFonts w:ascii="Arial" w:hAnsi="Arial" w:eastAsia="Arial" w:cs="Arial"/>
-          <w:sz w:val="22"/>
-          <w:szCs w:val="22"/>
-        </w:rPr>
-        <w:t>time</w:t>
-      </w:r>
-      <w:r>
-        <w:rPr>
-          <w:rFonts w:ascii="Arial" w:hAnsi="Arial" w:eastAsia="Arial" w:cs="Arial"/>
-          <w:sz w:val="22"/>
-          <w:szCs w:val="22"/>
-        </w:rPr>
-        <w:t xml:space="preserve">, as actual service times could vary. </w:t>
-      </w:r>
-      <w:r>
-        <w:rPr>
-          <w:rFonts w:ascii="Arial" w:hAnsi="Arial" w:eastAsia="Arial" w:cs="Arial"/>
-          <w:sz w:val="22"/>
-          <w:szCs w:val="22"/>
-        </w:rPr>
-        <w:t xml:space="preserve">The service may take longer depending on the time of day, the workers present, etc. </w:t>
-      </w:r>
-      <w:r>
-        <w:rPr>
-          <w:rFonts w:ascii="Arial" w:hAnsi="Arial" w:eastAsia="Arial" w:cs="Arial"/>
-          <w:sz w:val="22"/>
-          <w:szCs w:val="22"/>
-        </w:rPr>
-        <w:t>Additionally, queue information can change rapidly in cases where a user leaves the queue, admins change priorities, or a service takes longer than expected.</w:t>
-      </w:r>
-      <w:r>
-        <w:rPr>
-          <w:rFonts w:ascii="Arial" w:hAnsi="Arial" w:eastAsia="Arial" w:cs="Arial"/>
-          <w:sz w:val="22"/>
-          <w:szCs w:val="22"/>
-        </w:rPr>
-        <w:t xml:space="preserve"> </w:t>
-      </w:r>
-      <w:r>
-        <w:rPr>
-          <w:rFonts w:ascii="Arial" w:hAnsi="Arial" w:eastAsia="Arial" w:cs="Arial"/>
-          <w:sz w:val="22"/>
-          <w:szCs w:val="22"/>
-        </w:rPr>
-        <w:t>N</w:t>
-      </w:r>
-      <w:r>
-        <w:rPr>
-          <w:rFonts w:ascii="Arial" w:hAnsi="Arial" w:eastAsia="Arial" w:cs="Arial"/>
-          <w:sz w:val="22"/>
-          <w:szCs w:val="22"/>
-        </w:rPr>
-        <w:t>otifications</w:t>
-      </w:r>
-      <w:r>
-        <w:rPr>
-          <w:rFonts w:ascii="Arial" w:hAnsi="Arial" w:eastAsia="Arial" w:cs="Arial"/>
-          <w:sz w:val="22"/>
-          <w:szCs w:val="22"/>
-        </w:rPr>
-        <w:t xml:space="preserve"> must be sent at the right times without sending any sort of duplicate or unnecessary information.</w:t>
-      </w:r>
-      <w:r>
-        <w:rPr>
-          <w:rFonts w:ascii="Arial" w:hAnsi="Arial" w:eastAsia="Arial" w:cs="Arial"/>
-          <w:sz w:val="22"/>
-          <w:szCs w:val="22"/>
-        </w:rPr>
-        <w:t xml:space="preserve"> </w:t>
-      </w:r>
-      <w:r>
-        <w:rPr>
-          <w:rFonts w:ascii="Arial" w:hAnsi="Arial" w:eastAsia="Arial" w:cs="Arial"/>
-          <w:sz w:val="22"/>
-          <w:szCs w:val="22"/>
-        </w:rPr>
-        <w:t>The system must also keep a fair queue while still supporting the higher priority levels.</w:t>
-      </w:r>
-      <w:r>
-        <w:rPr>
-          <w:rFonts w:ascii="Arial" w:hAnsi="Arial" w:eastAsia="Arial" w:cs="Arial"/>
-          <w:sz w:val="22"/>
-          <w:szCs w:val="22"/>
-        </w:rPr>
-        <w:t xml:space="preserve"> QueueSmart should also be designed with the issue of scalability in mind so that multiple active queues and users can be handled simultaneously without significantly reducing performance or reliability of the application. </w:t>
-      </w:r>
-      <w:r>
-        <w:rPr>
-          <w:rFonts w:ascii="Arial" w:hAnsi="Arial" w:eastAsia="Arial" w:cs="Arial"/>
-          <w:sz w:val="22"/>
-          <w:szCs w:val="22"/>
-        </w:rPr>
-        <w:t>The program crashing/being dysfunctional can cause major issues for companies using QueueSmart.</w:t>
-      </w:r>
-      <w:r>
-        <w:rPr>
-          <w:rFonts w:ascii="Arial" w:hAnsi="Arial" w:eastAsia="Arial" w:cs="Arial"/>
-          <w:sz w:val="22"/>
-          <w:szCs w:val="22"/>
-        </w:rPr>
-        <w:t xml:space="preserve"> Finally, authentication and authorization </w:t>
-      </w:r>
-      <w:r>
-        <w:rPr>
-          <w:rFonts w:ascii="Arial" w:hAnsi="Arial" w:eastAsia="Arial" w:cs="Arial"/>
-          <w:sz w:val="22"/>
-          <w:szCs w:val="22"/>
-        </w:rPr>
-        <w:t>must</w:t>
-      </w:r>
-      <w:r>
-        <w:rPr>
-          <w:rFonts w:ascii="Arial" w:hAnsi="Arial" w:eastAsia="Arial" w:cs="Arial"/>
-          <w:sz w:val="22"/>
-          <w:szCs w:val="22"/>
-        </w:rPr>
-        <w:t xml:space="preserve"> ensure that normal users cannot access features that are administrator only.</w:t>
-      </w:r>
-    </w:p>
-    <w:p>
-      <w:pPr>
-        <w:spacing w:line="276" w:lineRule="auto"/>
-      </w:pPr>
-    </w:p>
+        <w:t xml:space="preserve">Some challenges that we expect are being able to accurately determine wait-time, as actual service times could vary. The service may take longer depending on the time of day, the workers present, etc. Additionally, queue information can change rapidly in cases where a user leaves the queue, admins change priorities, or a service takes longer than expected. </w:t>
+      </w:r>
+      <w:r>
+        <w:lastRenderedPageBreak/>
+        <w:t>Notifications must be sent at the right times without sending any sort of duplicate or unnecessary information. The system must also keep a fair queue while still supporting the higher priority levels. QueueSmart should also be designed with the issue of scalability in mind so that multiple active queues and users can be handled simultaneously without significantly reducing performance or reliability of the application. The program crashing/being dysfunctional can cause major issues for companies using QueueSmart. Finally, authentication and authorization must ensure that normal users cannot access features that are administrator only.</w:t>
+      </w:r>
+    </w:p>
+    <w:p/>
     <w:p>
       <w:pPr>
         <w:pStyle w:val="Heading2"/>
@@ -729,7 +213,6 @@
       <w:bookmarkStart w:id="3" w:name="_68llr56wlds4"/>
       <w:r>
         <w:rPr>
-          <w:rFonts w:ascii="Arial" w:hAnsi="Arial" w:eastAsia="Arial" w:cs="Arial"/>
           <w:b/>
           <w:bCs/>
           <w:sz w:val="34"/>
@@ -744,28 +227,7 @@
         <w:ind w:firstLine="720"/>
       </w:pPr>
       <w:r>
-        <w:rPr>
-          <w:rFonts w:ascii="Arial" w:hAnsi="Arial" w:eastAsia="Arial" w:cs="Arial"/>
-          <w:sz w:val="22"/>
-          <w:szCs w:val="22"/>
-        </w:rPr>
-        <w:t>For this project we will be using the S</w:t>
-      </w:r>
-      <w:r>
-        <w:rPr>
-          <w:rFonts w:ascii="Arial" w:hAnsi="Arial" w:eastAsia="Arial" w:cs="Arial"/>
-          <w:sz w:val="22"/>
-          <w:szCs w:val="22"/>
-        </w:rPr>
-        <w:t>crum</w:t>
-      </w:r>
-      <w:r>
-        <w:rPr>
-          <w:rFonts w:ascii="Arial" w:hAnsi="Arial" w:eastAsia="Arial" w:cs="Arial"/>
-          <w:sz w:val="22"/>
-          <w:szCs w:val="22"/>
-        </w:rPr>
-        <w:t xml:space="preserve"> development methodology. Scrum is an agile framework that divides the work into multiple sections called sprints. This allows us to build the project through iterative updates while giving us the flexibility of adjusting our design at any point during the process if changes are required. This is ideal for our project which is split into multiple assignments that require us to build our application piece by piece. Every work cycle will require us to evenly split the work amongst our group, execute our plan, receive feedback, and continuously improve our application. </w:t>
+        <w:t xml:space="preserve">For this project we will be using the Scrum development methodology. Scrum is an agile framework that divides the work into multiple sections called sprints. This allows us to build the project through iterative updates while giving us the flexibility of adjusting our design at any point during the process if changes are required. This is ideal for our project which is split into multiple assignments that require us to build our application piece by piece. Every work cycle will require us to evenly split the work amongst our group, execute our plan, receive feedback, and continuously improve our application. </w:t>
       </w:r>
     </w:p>
     <w:p>
@@ -773,28 +235,7 @@
         <w:ind w:firstLine="720"/>
       </w:pPr>
       <w:r>
-        <w:rPr>
-          <w:rFonts w:ascii="Arial" w:hAnsi="Arial" w:eastAsia="Arial" w:cs="Arial"/>
-          <w:sz w:val="22"/>
-          <w:szCs w:val="22"/>
-        </w:rPr>
-        <w:t xml:space="preserve">By using a shared repository on </w:t>
-      </w:r>
-      <w:r>
-        <w:rPr>
-          <w:rFonts w:ascii="Arial" w:hAnsi="Arial" w:eastAsia="Arial" w:cs="Arial"/>
-          <w:sz w:val="22"/>
-          <w:szCs w:val="22"/>
-        </w:rPr>
-        <w:t>GitHub</w:t>
-      </w:r>
-      <w:r>
-        <w:rPr>
-          <w:rFonts w:ascii="Arial" w:hAnsi="Arial" w:eastAsia="Arial" w:cs="Arial"/>
-          <w:sz w:val="22"/>
-          <w:szCs w:val="22"/>
-        </w:rPr>
-        <w:t xml:space="preserve"> we can coordinate our work efficiently and have a record of our individual contributions for each cycle of the project. With everyone involved in every cycle, everyone becomes familiar with every section of the application which facilitates communication within our group. </w:t>
+        <w:t xml:space="preserve">By using a shared repository on GitHub we can coordinate our work efficiently and have a record of our individual contributions for each cycle of the project. With everyone involved in every cycle, everyone becomes familiar with every section of the application which facilitates communication within our group. </w:t>
       </w:r>
     </w:p>
     <w:p>
@@ -813,7 +254,6 @@
       <w:bookmarkStart w:id="4" w:name="_539jdmilwa40"/>
       <w:r>
         <w:rPr>
-          <w:rFonts w:ascii="Arial" w:hAnsi="Arial" w:eastAsia="Arial" w:cs="Arial"/>
           <w:b/>
           <w:bCs/>
           <w:sz w:val="34"/>
@@ -840,7 +280,6 @@
       <w:bookmarkStart w:id="5" w:name="_n9rkqy14gmc1"/>
       <w:r>
         <w:rPr>
-          <w:rFonts w:ascii="Arial" w:hAnsi="Arial" w:eastAsia="Arial" w:cs="Arial"/>
           <w:b/>
           <w:bCs/>
           <w:color w:val="000000"/>
@@ -852,12 +291,12 @@
       <w:bookmarkEnd w:id="5"/>
     </w:p>
     <w:p>
-      <w:pPr>
-        <w:spacing w:line="276" w:lineRule="auto"/>
-      </w:pPr>
-      <w:r>
+      <w:r>
+        <w:rPr>
+          <w:noProof/>
+        </w:rPr>
         <w:drawing>
-          <wp:inline distT="0" distB="0" distL="0" distR="0">
+          <wp:inline distT="0" distB="0" distL="0" distR="0" wp14:anchorId="00E4835B" wp14:editId="598FFD31">
             <wp:extent cx="5829300" cy="1447800"/>
             <wp:effectExtent l="0" t="0" r="0" b="0"/>
             <wp:docPr id="100000" name="Picture 100000" descr="image.png"/>
@@ -872,7 +311,7 @@
                     <pic:cNvPicPr/>
                   </pic:nvPicPr>
                   <pic:blipFill>
-                    <a:blip r:embed="rId8"/>
+                    <a:blip r:embed="rId5"/>
                     <a:stretch>
                       <a:fillRect/>
                     </a:stretch>
@@ -910,7 +349,6 @@
       <w:bookmarkStart w:id="6" w:name="_mr012098t7d3"/>
       <w:r>
         <w:rPr>
-          <w:rFonts w:ascii="Arial" w:hAnsi="Arial" w:eastAsia="Arial" w:cs="Arial"/>
           <w:b/>
           <w:bCs/>
           <w:color w:val="000000"/>
@@ -922,65 +360,34 @@
       <w:bookmarkEnd w:id="6"/>
     </w:p>
     <w:p>
-      <w:pPr>
-        <w:spacing w:line="276" w:lineRule="auto"/>
-      </w:pPr>
       <w:r>
         <w:tab/>
-      </w:r>
-      <w:r>
-        <w:rPr>
-          <w:rFonts w:ascii="Arial" w:cs="Arial"/>
-          <w:sz w:val="22"/>
-          <w:szCs w:val="22"/>
-        </w:rPr>
         <w:t>The User represents a student or customer who interacts with QueueSmart to register or log in, join or leave a queue, and view their current queue status and history. Users receive updated queue information through the application and may also receive email alerts when their queue status changes or their turn is approaching.</w:t>
       </w:r>
     </w:p>
     <w:p>
       <w:r>
         <w:tab/>
-      </w:r>
-      <w:r>
-        <w:rPr>
-          <w:rFonts w:ascii="Arial" w:cs="Arial"/>
-          <w:sz w:val="22"/>
-          <w:szCs w:val="22"/>
-        </w:rPr>
-        <w:t>The Administrator represents staff members who use QueueSmart to manage services and active queues. Administrators can create and update services, monitor queue activity, manage queue entries, and view basic usage data and queue history. Administrator access is separate from regular user access so that management features are only available to authorized staff.</w:t>
+        <w:t xml:space="preserve">The Administrator represents staff members who use QueueSmart to manage services and active queues. Administrators can create and update services, monitor queue activity, manage queue entries, and view basic usage data and queue history. Administrator access is </w:t>
+      </w:r>
+      <w:r>
+        <w:lastRenderedPageBreak/>
+        <w:t>separate from regular user access so that management features are only available to authorized staff.</w:t>
       </w:r>
     </w:p>
     <w:p>
       <w:r>
         <w:tab/>
-      </w:r>
-      <w:r>
-        <w:rPr>
-          <w:rFonts w:ascii="Arial" w:cs="Arial"/>
-          <w:sz w:val="22"/>
-          <w:szCs w:val="22"/>
-        </w:rPr>
         <w:t>The QueueSmart Web Application represents the complete QueueSmart system at the context level. It handles interactions from both users and administrators, including authentication, queue participation, service management, queue status, and history. In the System Context Diagram, QueueSmart is shown as a single system rather than its individual internal components.</w:t>
       </w:r>
     </w:p>
     <w:p>
       <w:r>
         <w:tab/>
-      </w:r>
-      <w:r>
-        <w:rPr>
-          <w:rFonts w:ascii="Arial" w:cs="Arial"/>
-          <w:sz w:val="22"/>
-          <w:szCs w:val="22"/>
-        </w:rPr>
         <w:t>The External Email Service is responsible for delivering emails generated by QueueSmart. The application will send verification emails and queue notification requests to the external service, which then delivers alerts to users. The email service is handled by an external provider rather than directly by the web application. All queue rules, user roles, service management, history, and wait-time calculations remain inside QueueSmart.</w:t>
       </w:r>
     </w:p>
-    <w:p>
-      <w:pPr>
-        <w:spacing w:line="276" w:lineRule="auto"/>
-      </w:pPr>
-    </w:p>
+    <w:p/>
     <w:p>
       <w:pPr>
         <w:pStyle w:val="Heading3"/>
@@ -998,7 +405,6 @@
       <w:bookmarkStart w:id="7" w:name="_y8o0qr9cv2q4"/>
       <w:r>
         <w:rPr>
-          <w:rFonts w:ascii="Arial" w:hAnsi="Arial" w:eastAsia="Arial" w:cs="Arial"/>
           <w:b/>
           <w:bCs/>
           <w:color w:val="000000"/>
@@ -1010,12 +416,12 @@
       <w:bookmarkEnd w:id="7"/>
     </w:p>
     <w:p>
-      <w:pPr>
-        <w:spacing w:line="276" w:lineRule="auto"/>
-      </w:pPr>
-      <w:r>
+      <w:r>
+        <w:rPr>
+          <w:noProof/>
+        </w:rPr>
         <w:drawing>
-          <wp:inline distT="0" distB="0" distL="0" distR="0">
+          <wp:inline distT="0" distB="0" distL="0" distR="0" wp14:anchorId="03F1376B" wp14:editId="57E7B10D">
             <wp:extent cx="5943600" cy="942975"/>
             <wp:effectExtent l="0" t="0" r="0" b="9525"/>
             <wp:docPr id="100001" name="Picture 100001"/>
@@ -1030,7 +436,7 @@
                     <pic:cNvPicPr/>
                   </pic:nvPicPr>
                   <pic:blipFill>
-                    <a:blip r:embed="rId9"/>
+                    <a:blip r:embed="rId6"/>
                     <a:stretch>
                       <a:fillRect/>
                     </a:stretch>
@@ -1068,7 +474,6 @@
       <w:bookmarkStart w:id="8" w:name="_1ybz22a7dtl"/>
       <w:r>
         <w:rPr>
-          <w:rFonts w:ascii="Arial" w:hAnsi="Arial" w:eastAsia="Arial" w:cs="Arial"/>
           <w:b/>
           <w:bCs/>
           <w:color w:val="000000"/>
@@ -1084,84 +489,28 @@
         <w:ind w:firstLine="720"/>
       </w:pPr>
       <w:r>
-        <w:lastRenderedPageBreak/>
-        <w:rPr>
-          <w:rFonts w:ascii="Arial" w:hAnsi="Arial" w:eastAsia="Arial" w:cs="Arial"/>
-          <w:sz w:val="22"/>
-          <w:szCs w:val="22"/>
-        </w:rPr>
-        <w:t>The Web Frontend provides interfaces to both the regular users and administrators use. It displays queue position, estimated wait</w:t>
-      </w:r>
-      <w:r>
-        <w:rPr>
-          <w:rFonts w:ascii="Arial" w:hAnsi="Arial" w:eastAsia="Arial" w:cs="Arial"/>
-          <w:sz w:val="22"/>
-          <w:szCs w:val="22"/>
-        </w:rPr>
-        <w:t>-</w:t>
-      </w:r>
-      <w:r>
-        <w:rPr>
-          <w:rFonts w:ascii="Arial" w:hAnsi="Arial" w:eastAsia="Arial" w:cs="Arial"/>
-          <w:sz w:val="22"/>
-          <w:szCs w:val="22"/>
-        </w:rPr>
-        <w:t>time, history, available services, and administrator management tools. The frontend sends user actions directly to the backend, without directly changing application data.</w:t>
-      </w:r>
-    </w:p>
-    <w:p>
-      <w:pPr>
-        <w:spacing w:line="276" w:lineRule="auto"/>
-      </w:pPr>
+        <w:t>The Web Frontend provides interfaces to both the regular users and administrators use. It displays queue position, estimated wait-time, history, available services, and administrator management tools. The frontend sends user actions directly to the backend, without directly changing application data.</w:t>
+      </w:r>
+    </w:p>
+    <w:p>
       <w:r>
         <w:tab/>
-      </w:r>
-      <w:r>
-        <w:rPr>
-          <w:rFonts w:ascii="Arial" w:hAnsi="Arial" w:eastAsia="Arial" w:cs="Arial"/>
-          <w:sz w:val="22"/>
-          <w:szCs w:val="22"/>
-        </w:rPr>
         <w:t>The Backend/API contains all main application logic. It authenticates users, manages services, processes join and leave requests, checks whether a user has the permissions of a regular user or an administrator, orders queue entries by arrival time and priority, computes estimated wait-times for users requests, prepares basic usage statistics, and records the queue history.</w:t>
       </w:r>
     </w:p>
     <w:p>
-      <w:pPr>
-        <w:spacing w:line="276" w:lineRule="auto"/>
-      </w:pPr>
       <w:r>
         <w:tab/>
-      </w:r>
-      <w:r>
-        <w:rPr>
-          <w:rFonts w:ascii="Arial" w:hAnsi="Arial" w:eastAsia="Arial" w:cs="Arial"/>
-          <w:sz w:val="22"/>
-          <w:szCs w:val="22"/>
-        </w:rPr>
         <w:t>The Notification Module receives notification events directly from the backend. For instance, when a user becomes close to the front of the queue, the backend may trigger a notification event. This notification module can then use the external email service to deliver the message to the user. Additionally, in-app notifications can be shown directly through the web application.</w:t>
       </w:r>
     </w:p>
     <w:p>
-      <w:pPr>
-        <w:spacing w:line="276" w:lineRule="auto"/>
-      </w:pPr>
       <w:r>
         <w:tab/>
-      </w:r>
-      <w:r>
-        <w:rPr>
-          <w:rFonts w:ascii="Arial" w:hAnsi="Arial" w:eastAsia="Arial" w:cs="Arial"/>
-          <w:sz w:val="22"/>
-          <w:szCs w:val="22"/>
-        </w:rPr>
         <w:t>The Database stores persistent information, such as user accounts, services, roles, active queue entries, queue participation history, and priority information. Keeping this information in one data store allows the system to maintain queue state, even if a user closes their browser.</w:t>
       </w:r>
     </w:p>
-    <w:p>
-      <w:pPr>
-        <w:spacing w:line="276" w:lineRule="auto"/>
-      </w:pPr>
-    </w:p>
+    <w:p/>
     <w:p>
       <w:pPr>
         <w:pStyle w:val="Heading2"/>
@@ -1178,12 +527,12 @@
       <w:bookmarkStart w:id="9" w:name="_fanei6xsgk9"/>
       <w:r>
         <w:rPr>
-          <w:rFonts w:ascii="Arial" w:hAnsi="Arial" w:eastAsia="Arial" w:cs="Arial"/>
           <w:b/>
           <w:bCs/>
           <w:sz w:val="34"/>
           <w:szCs w:val="34"/>
         </w:rPr>
+        <w:lastRenderedPageBreak/>
         <w:t>4. Major Component Interaction Summary</w:t>
       </w:r>
       <w:bookmarkEnd w:id="9"/>
@@ -1193,11 +542,6 @@
         <w:spacing w:before="240" w:after="240"/>
       </w:pPr>
       <w:r>
-        <w:rPr>
-          <w:rFonts w:ascii="Arial" w:hAnsi="Arial" w:eastAsia="Arial" w:cs="Arial"/>
-          <w:sz w:val="22"/>
-          <w:szCs w:val="22"/>
-        </w:rPr>
         <w:t>A typical QueueSmart interaction works like this:</w:t>
       </w:r>
     </w:p>
@@ -1209,14 +553,8 @@
           <w:numId w:val="1"/>
         </w:numPr>
         <w:spacing w:before="240" w:after="240"/>
-        <w:ind w:left="720" w:hanging="360"/>
-      </w:pPr>
-      <w:r>
-        <w:rPr>
-          <w:rFonts w:ascii="Arial" w:hAnsi="Arial" w:eastAsia="Arial" w:cs="Arial"/>
-          <w:sz w:val="22"/>
-          <w:szCs w:val="22"/>
-        </w:rPr>
+      </w:pPr>
+      <w:r>
         <w:t>User or Administrator logs into the web application of QueueSmart.</w:t>
       </w:r>
     </w:p>
@@ -1228,14 +566,8 @@
           <w:numId w:val="1"/>
         </w:numPr>
         <w:spacing w:before="240" w:after="240"/>
-        <w:ind w:left="720" w:hanging="360"/>
-      </w:pPr>
-      <w:r>
-        <w:rPr>
-          <w:rFonts w:ascii="Arial" w:hAnsi="Arial" w:eastAsia="Arial" w:cs="Arial"/>
-          <w:sz w:val="22"/>
-          <w:szCs w:val="22"/>
-        </w:rPr>
+      </w:pPr>
+      <w:r>
         <w:t>Web frontend sends request to the backend.</w:t>
       </w:r>
     </w:p>
@@ -1247,14 +579,8 @@
           <w:numId w:val="1"/>
         </w:numPr>
         <w:spacing w:before="240" w:after="240"/>
-        <w:ind w:left="720" w:hanging="360"/>
-      </w:pPr>
-      <w:r>
-        <w:rPr>
-          <w:rFonts w:ascii="Arial" w:hAnsi="Arial" w:eastAsia="Arial" w:cs="Arial"/>
-          <w:sz w:val="22"/>
-          <w:szCs w:val="22"/>
-        </w:rPr>
+      </w:pPr>
+      <w:r>
         <w:t>Backend verifies the user’s account and role.</w:t>
       </w:r>
     </w:p>
@@ -1266,47 +592,9 @@
           <w:numId w:val="1"/>
         </w:numPr>
         <w:spacing w:before="240" w:after="240"/>
-        <w:ind w:left="720" w:hanging="360"/>
-      </w:pPr>
-      <w:r>
-        <w:rPr>
-          <w:rFonts w:ascii="Arial" w:hAnsi="Arial" w:eastAsia="Arial" w:cs="Arial"/>
-          <w:sz w:val="22"/>
-          <w:szCs w:val="22"/>
-        </w:rPr>
-        <w:t xml:space="preserve">When user joins a queue, backend creates a queue </w:t>
-      </w:r>
-      <w:r>
-        <w:rPr>
-          <w:rFonts w:ascii="Arial" w:hAnsi="Arial" w:eastAsia="Arial" w:cs="Arial"/>
-          <w:sz w:val="22"/>
-          <w:szCs w:val="22"/>
-        </w:rPr>
-        <w:t>entry for that user</w:t>
-      </w:r>
-      <w:r>
-        <w:rPr>
-          <w:rFonts w:ascii="Arial" w:hAnsi="Arial" w:eastAsia="Arial" w:cs="Arial"/>
-          <w:sz w:val="22"/>
-          <w:szCs w:val="22"/>
-        </w:rPr>
-        <w:t xml:space="preserve"> and stores </w:t>
-      </w:r>
-      <w:r>
-        <w:rPr>
-          <w:rFonts w:ascii="Arial" w:hAnsi="Arial" w:eastAsia="Arial" w:cs="Arial"/>
-          <w:sz w:val="22"/>
-          <w:szCs w:val="22"/>
-        </w:rPr>
-        <w:t xml:space="preserve">updates queue information </w:t>
-      </w:r>
-      <w:r>
-        <w:rPr>
-          <w:rFonts w:ascii="Arial" w:hAnsi="Arial" w:eastAsia="Arial" w:cs="Arial"/>
-          <w:sz w:val="22"/>
-          <w:szCs w:val="22"/>
-        </w:rPr>
-        <w:t>it in the database.</w:t>
+      </w:pPr>
+      <w:r>
+        <w:t>When user joins a queue, backend creates a queue entry for that user and stores updates queue information it in the database.</w:t>
       </w:r>
     </w:p>
     <w:p>
@@ -1317,31 +605,9 @@
           <w:numId w:val="1"/>
         </w:numPr>
         <w:spacing w:before="240" w:after="240"/>
-        <w:ind w:left="720" w:hanging="360"/>
-      </w:pPr>
-      <w:r>
-        <w:rPr>
-          <w:rFonts w:ascii="Arial" w:hAnsi="Arial" w:eastAsia="Arial" w:cs="Arial"/>
-          <w:sz w:val="22"/>
-          <w:szCs w:val="22"/>
-        </w:rPr>
-        <w:t>Backend determines user’s position using arrival time and priority, and estimates wait</w:t>
-      </w:r>
-      <w:r>
-        <w:rPr>
-          <w:rFonts w:ascii="Arial" w:hAnsi="Arial" w:eastAsia="Arial" w:cs="Arial"/>
-          <w:sz w:val="22"/>
-          <w:szCs w:val="22"/>
-        </w:rPr>
-        <w:t>-</w:t>
-      </w:r>
-      <w:r>
-        <w:rPr>
-          <w:rFonts w:ascii="Arial" w:hAnsi="Arial" w:eastAsia="Arial" w:cs="Arial"/>
-          <w:sz w:val="22"/>
-          <w:szCs w:val="22"/>
-        </w:rPr>
-        <w:t>time using expected duration of selected service.</w:t>
+      </w:pPr>
+      <w:r>
+        <w:t>Backend determines user’s position using arrival time and priority, and estimates wait-time using expected duration of selected service.</w:t>
       </w:r>
     </w:p>
     <w:p>
@@ -1352,14 +618,8 @@
           <w:numId w:val="1"/>
         </w:numPr>
         <w:spacing w:before="240" w:after="240"/>
-        <w:ind w:left="720" w:hanging="360"/>
-      </w:pPr>
-      <w:r>
-        <w:rPr>
-          <w:rFonts w:ascii="Arial" w:hAnsi="Arial" w:eastAsia="Arial" w:cs="Arial"/>
-          <w:sz w:val="22"/>
-          <w:szCs w:val="22"/>
-        </w:rPr>
+      </w:pPr>
+      <w:r>
         <w:t>Updated queue information returned to frontend and displayed to user.</w:t>
       </w:r>
     </w:p>
@@ -1371,14 +631,8 @@
           <w:numId w:val="1"/>
         </w:numPr>
         <w:spacing w:before="240" w:after="240"/>
-        <w:ind w:left="720" w:hanging="360"/>
-      </w:pPr>
-      <w:r>
-        <w:rPr>
-          <w:rFonts w:ascii="Arial" w:hAnsi="Arial" w:eastAsia="Arial" w:cs="Arial"/>
-          <w:sz w:val="22"/>
-          <w:szCs w:val="22"/>
-        </w:rPr>
+      </w:pPr>
+      <w:r>
         <w:t>When user’s turn is coming up, backend triggers notification module, sending an email notification through the external email service.</w:t>
       </w:r>
     </w:p>
@@ -1390,14 +644,8 @@
           <w:numId w:val="1"/>
         </w:numPr>
         <w:spacing w:before="240" w:after="240"/>
-        <w:ind w:left="720" w:hanging="360"/>
-      </w:pPr>
-      <w:r>
-        <w:rPr>
-          <w:rFonts w:ascii="Arial" w:hAnsi="Arial" w:eastAsia="Arial" w:cs="Arial"/>
-          <w:sz w:val="22"/>
-          <w:szCs w:val="22"/>
-        </w:rPr>
+      </w:pPr>
+      <w:r>
         <w:t>When service completed or user leaves queue, system updates active queue and saves the result in history.</w:t>
       </w:r>
     </w:p>
@@ -1409,14 +657,8 @@
           <w:numId w:val="1"/>
         </w:numPr>
         <w:spacing w:before="240" w:after="240"/>
-        <w:ind w:left="720" w:hanging="360"/>
-      </w:pPr>
-      <w:r>
-        <w:rPr>
-          <w:rFonts w:ascii="Arial" w:hAnsi="Arial" w:eastAsia="Arial" w:cs="Arial"/>
-          <w:sz w:val="22"/>
-          <w:szCs w:val="22"/>
-        </w:rPr>
+      </w:pPr>
+      <w:r>
         <w:t>Administrators can view current queue state and basic usage statistics using information stored in the database.</w:t>
       </w:r>
     </w:p>
@@ -1425,19 +667,10 @@
         <w:spacing w:before="240" w:after="240"/>
       </w:pPr>
       <w:r>
-        <w:rPr>
-          <w:rFonts w:ascii="Arial" w:hAnsi="Arial" w:eastAsia="Arial" w:cs="Arial"/>
-          <w:sz w:val="22"/>
-          <w:szCs w:val="22"/>
-        </w:rPr>
         <w:t>This design keeps the web application simple enough for the first stage of the project, and leaves room for later assignments to define things like the UI, APIs, and database structure with more detail.</w:t>
       </w:r>
     </w:p>
-    <w:p>
-      <w:pPr>
-        <w:spacing w:line="276" w:lineRule="auto"/>
-      </w:pPr>
-    </w:p>
+    <w:p/>
     <w:p>
       <w:pPr>
         <w:pStyle w:val="Heading2"/>
@@ -1453,9 +686,7 @@
       </w:pPr>
       <w:bookmarkStart w:id="10" w:name="_pd330yj8v2k7"/>
       <w:r>
-        <w:lastRenderedPageBreak/>
-        <w:rPr>
-          <w:rFonts w:ascii="Arial" w:hAnsi="Arial" w:eastAsia="Arial" w:cs="Arial"/>
+        <w:rPr>
           <w:b/>
           <w:bCs/>
           <w:sz w:val="34"/>
@@ -1479,13 +710,7 @@
           <w:insideV w:val="nil"/>
         </w:tblBorders>
         <w:tblLayout w:type="fixed"/>
-        <w:tblCellMar>
-          <w:top w:w="100" w:type="dxa"/>
-          <w:left w:w="100" w:type="dxa"/>
-          <w:bottom w:w="100" w:type="dxa"/>
-          <w:right w:w="100" w:type="dxa"/>
-        </w:tblCellMar>
-        <w:tblLook w:firstRow="1" w:lastRow="1" w:firstColumn="1" w:lastColumn="1" w:noHBand="1" w:noVBand="1"/>
+        <w:tblLook w:val="07E0" w:firstRow="1" w:lastRow="1" w:firstColumn="1" w:lastColumn="1" w:noHBand="1" w:noVBand="1"/>
       </w:tblPr>
       <w:tblGrid>
         <w:gridCol w:w="1260"/>
@@ -1518,11 +743,8 @@
             </w:pPr>
             <w:r>
               <w:rPr>
-                <w:rFonts w:ascii="Arial" w:hAnsi="Arial" w:eastAsia="Arial" w:cs="Arial"/>
                 <w:b/>
                 <w:bCs/>
-                <w:sz w:val="22"/>
-                <w:szCs w:val="22"/>
               </w:rPr>
               <w:t>Group Member</w:t>
             </w:r>
@@ -1550,11 +772,8 @@
             </w:pPr>
             <w:r>
               <w:rPr>
-                <w:rFonts w:ascii="Arial" w:hAnsi="Arial" w:eastAsia="Arial" w:cs="Arial"/>
                 <w:b/>
                 <w:bCs/>
-                <w:sz w:val="22"/>
-                <w:szCs w:val="22"/>
               </w:rPr>
               <w:t>Contribution</w:t>
             </w:r>
@@ -1582,11 +801,8 @@
             </w:pPr>
             <w:r>
               <w:rPr>
-                <w:rFonts w:ascii="Arial" w:hAnsi="Arial" w:eastAsia="Arial" w:cs="Arial"/>
                 <w:b/>
                 <w:bCs/>
-                <w:sz w:val="22"/>
-                <w:szCs w:val="22"/>
               </w:rPr>
               <w:t>Discussion Notes</w:t>
             </w:r>
@@ -1614,15 +830,7 @@
             </w:tcMar>
           </w:tcPr>
           <w:p>
-            <w:pPr>
-              <w:spacing w:line="276" w:lineRule="auto"/>
-            </w:pPr>
             <w:r>
-              <w:rPr>
-                <w:rFonts w:ascii="Arial" w:hAnsi="Arial" w:eastAsia="Arial" w:cs="Arial"/>
-                <w:sz w:val="22"/>
-                <w:szCs w:val="22"/>
-              </w:rPr>
               <w:t>Tyler Landgrebe</w:t>
             </w:r>
           </w:p>
@@ -1644,16 +852,14 @@
             </w:tcMar>
           </w:tcPr>
           <w:p>
-            <w:pPr>
-              <w:spacing w:line="276" w:lineRule="auto"/>
-            </w:pPr>
             <w:r>
-              <w:rPr>
-                <w:rFonts w:ascii="Arial" w:hAnsi="Arial" w:eastAsia="Arial" w:cs="Arial"/>
-                <w:sz w:val="22"/>
-                <w:szCs w:val="22"/>
-              </w:rPr>
-              <w:t>Designed the optional Container Diagram, wrote the component interaction explanation, and integrated/proofread the final Markdown submission. Touched up and cleaned up document.</w:t>
+              <w:t xml:space="preserve">Designed the optional Container Diagram, wrote the component interaction explanation, and integrated/proofread the final </w:t>
+            </w:r>
+            <w:r>
+              <w:t>PDF</w:t>
+            </w:r>
+            <w:r>
+              <w:t xml:space="preserve"> submission. Touched up and cleaned up document.</w:t>
             </w:r>
           </w:p>
         </w:tc>
@@ -1674,15 +880,7 @@
             </w:tcMar>
           </w:tcPr>
           <w:p>
-            <w:pPr>
-              <w:spacing w:line="276" w:lineRule="auto"/>
-            </w:pPr>
             <w:r>
-              <w:rPr>
-                <w:rFonts w:ascii="Arial" w:hAnsi="Arial" w:eastAsia="Arial" w:cs="Arial"/>
-                <w:sz w:val="22"/>
-                <w:szCs w:val="22"/>
-              </w:rPr>
               <w:t>Focused on internal component responsibilities and consistency of the final document.</w:t>
             </w:r>
           </w:p>
@@ -1709,15 +907,7 @@
             </w:tcMar>
           </w:tcPr>
           <w:p>
-            <w:pPr>
-              <w:spacing w:line="276" w:lineRule="auto"/>
-            </w:pPr>
             <w:r>
-              <w:rPr>
-                <w:rFonts w:ascii="Arial" w:hAnsi="Arial" w:eastAsia="Arial" w:cs="Arial"/>
-                <w:sz w:val="22"/>
-                <w:szCs w:val="22"/>
-              </w:rPr>
               <w:t>Chase Beeler</w:t>
             </w:r>
           </w:p>
@@ -1739,15 +929,7 @@
             </w:tcMar>
           </w:tcPr>
           <w:p>
-            <w:pPr>
-              <w:spacing w:line="276" w:lineRule="auto"/>
-            </w:pPr>
             <w:r>
-              <w:rPr>
-                <w:rFonts w:ascii="Arial" w:hAnsi="Arial" w:eastAsia="Arial" w:cs="Arial"/>
-                <w:sz w:val="22"/>
-                <w:szCs w:val="22"/>
-              </w:rPr>
               <w:t>Designed the System Context Diagram and wrote the System Context explanation, including the system boundary and external email service.</w:t>
             </w:r>
           </w:p>
@@ -1769,15 +951,7 @@
             </w:tcMar>
           </w:tcPr>
           <w:p>
-            <w:pPr>
-              <w:spacing w:line="276" w:lineRule="auto"/>
-            </w:pPr>
             <w:r>
-              <w:rPr>
-                <w:rFonts w:ascii="Arial" w:hAnsi="Arial" w:eastAsia="Arial" w:cs="Arial"/>
-                <w:sz w:val="22"/>
-                <w:szCs w:val="22"/>
-              </w:rPr>
               <w:t>Focused on high-level architecture and external interactions.</w:t>
             </w:r>
           </w:p>
@@ -1804,15 +978,8 @@
             </w:tcMar>
           </w:tcPr>
           <w:p>
-            <w:pPr>
-              <w:spacing w:line="276" w:lineRule="auto"/>
-            </w:pPr>
             <w:r>
-              <w:rPr>
-                <w:rFonts w:ascii="Arial" w:hAnsi="Arial" w:eastAsia="Arial" w:cs="Arial"/>
-                <w:sz w:val="22"/>
-                <w:szCs w:val="22"/>
-              </w:rPr>
+              <w:lastRenderedPageBreak/>
               <w:t>Jeremy Yang</w:t>
             </w:r>
           </w:p>
@@ -1834,15 +1001,7 @@
             </w:tcMar>
           </w:tcPr>
           <w:p>
-            <w:pPr>
-              <w:spacing w:line="276" w:lineRule="auto"/>
-            </w:pPr>
             <w:r>
-              <w:rPr>
-                <w:rFonts w:ascii="Arial" w:hAnsi="Arial" w:eastAsia="Arial" w:cs="Arial"/>
-                <w:sz w:val="22"/>
-                <w:szCs w:val="22"/>
-              </w:rPr>
               <w:t>Wrote the Initial Thoughts section, defined the main users and their interactions, identified key features, and reviewed the user-side flows in the System Context Diagram.</w:t>
             </w:r>
           </w:p>
@@ -1864,15 +1023,7 @@
             </w:tcMar>
           </w:tcPr>
           <w:p>
-            <w:pPr>
-              <w:spacing w:line="276" w:lineRule="auto"/>
-            </w:pPr>
             <w:r>
-              <w:rPr>
-                <w:rFonts w:ascii="Arial" w:hAnsi="Arial" w:eastAsia="Arial" w:cs="Arial"/>
-                <w:sz w:val="22"/>
-                <w:szCs w:val="22"/>
-              </w:rPr>
               <w:t>Focused on requirements from the regular-user perspective and queue usability.</w:t>
             </w:r>
           </w:p>
@@ -1899,15 +1050,7 @@
             </w:tcMar>
           </w:tcPr>
           <w:p>
-            <w:pPr>
-              <w:spacing w:line="276" w:lineRule="auto"/>
-            </w:pPr>
             <w:r>
-              <w:rPr>
-                <w:rFonts w:ascii="Arial" w:hAnsi="Arial" w:eastAsia="Arial" w:cs="Arial"/>
-                <w:sz w:val="22"/>
-                <w:szCs w:val="22"/>
-              </w:rPr>
               <w:t>Alan Garcia</w:t>
             </w:r>
           </w:p>
@@ -1929,15 +1072,7 @@
             </w:tcMar>
           </w:tcPr>
           <w:p>
-            <w:pPr>
-              <w:spacing w:line="276" w:lineRule="auto"/>
-            </w:pPr>
             <w:r>
-              <w:rPr>
-                <w:rFonts w:ascii="Arial" w:hAnsi="Arial" w:eastAsia="Arial" w:cs="Arial"/>
-                <w:sz w:val="22"/>
-                <w:szCs w:val="22"/>
-              </w:rPr>
               <w:t>Wrote the Development Methodology section, defined the Agile/Scrum workflow, described the GitHub collaboration process, and documented major design challenges.</w:t>
             </w:r>
           </w:p>
@@ -1959,29 +1094,18 @@
             </w:tcMar>
           </w:tcPr>
           <w:p>
-            <w:pPr>
-              <w:spacing w:line="276" w:lineRule="auto"/>
-            </w:pPr>
             <w:r>
-              <w:rPr>
-                <w:rFonts w:ascii="Arial" w:hAnsi="Arial" w:eastAsia="Arial" w:cs="Arial"/>
-                <w:sz w:val="22"/>
-                <w:szCs w:val="22"/>
-              </w:rPr>
               <w:t>Focused on how the team will organize work across A1–A4 and the final project.</w:t>
             </w:r>
           </w:p>
         </w:tc>
       </w:tr>
     </w:tbl>
-    <w:p>
-      <w:pPr>
-        <w:spacing w:line="276" w:lineRule="auto"/>
-      </w:pPr>
-    </w:p>
+    <w:p/>
     <w:sectPr>
       <w:pgSz w:w="12240" w:h="15840"/>
       <w:pgMar w:top="1440" w:right="1440" w:bottom="1440" w:left="1440" w:header="720" w:footer="720" w:gutter="0"/>
+      <w:cols w:space="720"/>
     </w:sectPr>
   </w:body>
 </w:document>

</xml_diff>